<commit_message>
docs: 更新 traindoc.docx，PG021 改名为 FormattExample.pdf
- docs/traindoc.docx 更新为 2026-10-18 21:50 最新版（4,403,756 字节）
- docs/pg021_axi_dma-en-us-7.1.pdf -> docs/FormattExample.pdf
- README 目录树同步（含 购买参考/）
</commit_message>
<xml_diff>
--- a/docs/traindoc.docx
+++ b/docs/traindoc.docx
@@ -37,16 +37,24 @@
       <w:pPr>
         <w:spacing w:after="160"/>
       </w:pPr>
+      <w:proofErr w:type="spellStart"/>
       <w:r>
         <w:rPr>
           <w:sz w:val="32"/>
         </w:rPr>
-        <w:t xml:space="preserve">OpenColink </w:t>
-      </w:r>
+        <w:t>OpenColink</w:t>
+      </w:r>
+      <w:proofErr w:type="spellEnd"/>
       <w:r>
         <w:rPr>
           <w:sz w:val="32"/>
         </w:rPr>
+        <w:t xml:space="preserve"> </w:t>
+      </w:r>
+      <w:r>
+        <w:rPr>
+          <w:sz w:val="32"/>
+        </w:rPr>
         <w:t>标准化培训教材</w:t>
       </w:r>
     </w:p>
@@ -111,6 +119,7 @@
         </w:rPr>
         <w:t xml:space="preserve">Beta </w:t>
       </w:r>
+      <w:proofErr w:type="gramStart"/>
       <w:r>
         <w:rPr>
           <w:color w:val="4B5563"/>
@@ -123,13 +132,21 @@
           <w:color w:val="4B5563"/>
           <w:sz w:val="19"/>
         </w:rPr>
-        <w:t xml:space="preserve">  |  2026 </w:t>
-      </w:r>
+        <w:t xml:space="preserve">  |</w:t>
+      </w:r>
+      <w:proofErr w:type="gramEnd"/>
       <w:r>
         <w:rPr>
           <w:color w:val="4B5563"/>
           <w:sz w:val="19"/>
         </w:rPr>
+        <w:t xml:space="preserve">  2026 </w:t>
+      </w:r>
+      <w:r>
+        <w:rPr>
+          <w:color w:val="4B5563"/>
+          <w:sz w:val="19"/>
+        </w:rPr>
         <w:t>年</w:t>
       </w:r>
       <w:r>
@@ -139,6 +156,7 @@
         </w:rPr>
         <w:t xml:space="preserve"> 9 </w:t>
       </w:r>
+      <w:proofErr w:type="gramStart"/>
       <w:r>
         <w:rPr>
           <w:color w:val="4B5563"/>
@@ -151,8 +169,25 @@
           <w:color w:val="4B5563"/>
           <w:sz w:val="19"/>
         </w:rPr>
-        <w:t xml:space="preserve">  |  OpenColinkLab</w:t>
-      </w:r>
+        <w:t xml:space="preserve">  |</w:t>
+      </w:r>
+      <w:proofErr w:type="gramEnd"/>
+      <w:r>
+        <w:rPr>
+          <w:color w:val="4B5563"/>
+          <w:sz w:val="19"/>
+        </w:rPr>
+        <w:t xml:space="preserve">  </w:t>
+      </w:r>
+      <w:proofErr w:type="spellStart"/>
+      <w:r>
+        <w:rPr>
+          <w:color w:val="4B5563"/>
+          <w:sz w:val="19"/>
+        </w:rPr>
+        <w:t>OpenColinkLab</w:t>
+      </w:r>
+      <w:proofErr w:type="spellEnd"/>
     </w:p>
     <w:p>
       <w:pPr>
@@ -217,12 +252,11 @@
           <w:tab w:val="right" w:leader="dot" w:pos="10070"/>
         </w:tabs>
         <w:rPr>
-          <w:rFonts w:asciiTheme="minorHAnsi" w:eastAsiaTheme="minorEastAsia" w:hAnsiTheme="minorHAnsi" w:cstheme="minorBidi" w:hint="eastAsia"/>
+          <w:rFonts w:asciiTheme="minorHAnsi" w:eastAsiaTheme="minorEastAsia" w:hAnsiTheme="minorHAnsi" w:cstheme="minorBidi"/>
           <w:noProof/>
           <w:color w:val="auto"/>
           <w:kern w:val="2"/>
           <w:sz w:val="22"/>
-          <w14:ligatures w14:val="standardContextual"/>
         </w:rPr>
       </w:pPr>
       <w:r>
@@ -321,12 +355,11 @@
           <w:tab w:val="right" w:leader="dot" w:pos="10070"/>
         </w:tabs>
         <w:rPr>
-          <w:rFonts w:asciiTheme="minorHAnsi" w:eastAsiaTheme="minorEastAsia" w:hAnsiTheme="minorHAnsi" w:cstheme="minorBidi" w:hint="eastAsia"/>
+          <w:rFonts w:asciiTheme="minorHAnsi" w:eastAsiaTheme="minorEastAsia" w:hAnsiTheme="minorHAnsi" w:cstheme="minorBidi"/>
           <w:noProof/>
           <w:color w:val="auto"/>
           <w:kern w:val="2"/>
           <w:sz w:val="22"/>
-          <w14:ligatures w14:val="standardContextual"/>
         </w:rPr>
       </w:pPr>
       <w:hyperlink w:anchor="_Toc243250948" w:history="1">
@@ -344,7 +377,6 @@
             <w:color w:val="auto"/>
             <w:kern w:val="2"/>
             <w:sz w:val="22"/>
-            <w14:ligatures w14:val="standardContextual"/>
           </w:rPr>
           <w:tab/>
         </w:r>
@@ -434,12 +466,11 @@
           <w:tab w:val="right" w:leader="dot" w:pos="10070"/>
         </w:tabs>
         <w:rPr>
-          <w:rFonts w:asciiTheme="minorHAnsi" w:eastAsiaTheme="minorEastAsia" w:hAnsiTheme="minorHAnsi" w:cstheme="minorBidi" w:hint="eastAsia"/>
+          <w:rFonts w:asciiTheme="minorHAnsi" w:eastAsiaTheme="minorEastAsia" w:hAnsiTheme="minorHAnsi" w:cstheme="minorBidi"/>
           <w:noProof/>
           <w:color w:val="auto"/>
           <w:kern w:val="2"/>
           <w:sz w:val="22"/>
-          <w14:ligatures w14:val="standardContextual"/>
         </w:rPr>
       </w:pPr>
       <w:hyperlink w:anchor="_Toc243250949" w:history="1">
@@ -457,7 +488,6 @@
             <w:color w:val="auto"/>
             <w:kern w:val="2"/>
             <w:sz w:val="22"/>
-            <w14:ligatures w14:val="standardContextual"/>
           </w:rPr>
           <w:tab/>
         </w:r>
@@ -547,12 +577,11 @@
           <w:tab w:val="right" w:leader="dot" w:pos="10070"/>
         </w:tabs>
         <w:rPr>
-          <w:rFonts w:asciiTheme="minorHAnsi" w:eastAsiaTheme="minorEastAsia" w:hAnsiTheme="minorHAnsi" w:cstheme="minorBidi" w:hint="eastAsia"/>
+          <w:rFonts w:asciiTheme="minorHAnsi" w:eastAsiaTheme="minorEastAsia" w:hAnsiTheme="minorHAnsi" w:cstheme="minorBidi"/>
           <w:noProof/>
           <w:color w:val="auto"/>
           <w:kern w:val="2"/>
           <w:sz w:val="22"/>
-          <w14:ligatures w14:val="standardContextual"/>
         </w:rPr>
       </w:pPr>
       <w:hyperlink w:anchor="_Toc243250950" w:history="1">
@@ -570,7 +599,6 @@
             <w:color w:val="auto"/>
             <w:kern w:val="2"/>
             <w:sz w:val="22"/>
-            <w14:ligatures w14:val="standardContextual"/>
           </w:rPr>
           <w:tab/>
         </w:r>
@@ -660,12 +688,11 @@
           <w:tab w:val="right" w:leader="dot" w:pos="10070"/>
         </w:tabs>
         <w:rPr>
-          <w:rFonts w:asciiTheme="minorHAnsi" w:eastAsiaTheme="minorEastAsia" w:hAnsiTheme="minorHAnsi" w:cstheme="minorBidi" w:hint="eastAsia"/>
+          <w:rFonts w:asciiTheme="minorHAnsi" w:eastAsiaTheme="minorEastAsia" w:hAnsiTheme="minorHAnsi" w:cstheme="minorBidi"/>
           <w:noProof/>
           <w:color w:val="auto"/>
           <w:kern w:val="2"/>
           <w:sz w:val="22"/>
-          <w14:ligatures w14:val="standardContextual"/>
         </w:rPr>
       </w:pPr>
       <w:hyperlink w:anchor="_Toc243250951" w:history="1">
@@ -683,7 +710,6 @@
             <w:color w:val="auto"/>
             <w:kern w:val="2"/>
             <w:sz w:val="22"/>
-            <w14:ligatures w14:val="standardContextual"/>
           </w:rPr>
           <w:tab/>
         </w:r>
@@ -773,12 +799,11 @@
           <w:tab w:val="right" w:leader="dot" w:pos="10070"/>
         </w:tabs>
         <w:rPr>
-          <w:rFonts w:asciiTheme="minorHAnsi" w:eastAsiaTheme="minorEastAsia" w:hAnsiTheme="minorHAnsi" w:cstheme="minorBidi" w:hint="eastAsia"/>
+          <w:rFonts w:asciiTheme="minorHAnsi" w:eastAsiaTheme="minorEastAsia" w:hAnsiTheme="minorHAnsi" w:cstheme="minorBidi"/>
           <w:noProof/>
           <w:color w:val="auto"/>
           <w:kern w:val="2"/>
           <w:sz w:val="22"/>
-          <w14:ligatures w14:val="standardContextual"/>
         </w:rPr>
       </w:pPr>
       <w:hyperlink w:anchor="_Toc243250952" w:history="1">
@@ -796,7 +821,6 @@
             <w:color w:val="auto"/>
             <w:kern w:val="2"/>
             <w:sz w:val="22"/>
-            <w14:ligatures w14:val="standardContextual"/>
           </w:rPr>
           <w:tab/>
         </w:r>
@@ -886,12 +910,11 @@
           <w:tab w:val="right" w:leader="dot" w:pos="10070"/>
         </w:tabs>
         <w:rPr>
-          <w:rFonts w:asciiTheme="minorHAnsi" w:eastAsiaTheme="minorEastAsia" w:hAnsiTheme="minorHAnsi" w:cstheme="minorBidi" w:hint="eastAsia"/>
+          <w:rFonts w:asciiTheme="minorHAnsi" w:eastAsiaTheme="minorEastAsia" w:hAnsiTheme="minorHAnsi" w:cstheme="minorBidi"/>
           <w:noProof/>
           <w:color w:val="auto"/>
           <w:kern w:val="2"/>
           <w:sz w:val="22"/>
-          <w14:ligatures w14:val="standardContextual"/>
         </w:rPr>
       </w:pPr>
       <w:hyperlink w:anchor="_Toc243250953" w:history="1">
@@ -909,7 +932,6 @@
             <w:color w:val="auto"/>
             <w:kern w:val="2"/>
             <w:sz w:val="22"/>
-            <w14:ligatures w14:val="standardContextual"/>
           </w:rPr>
           <w:tab/>
         </w:r>
@@ -999,12 +1021,11 @@
           <w:tab w:val="right" w:leader="dot" w:pos="10070"/>
         </w:tabs>
         <w:rPr>
-          <w:rFonts w:asciiTheme="minorHAnsi" w:eastAsiaTheme="minorEastAsia" w:hAnsiTheme="minorHAnsi" w:cstheme="minorBidi" w:hint="eastAsia"/>
+          <w:rFonts w:asciiTheme="minorHAnsi" w:eastAsiaTheme="minorEastAsia" w:hAnsiTheme="minorHAnsi" w:cstheme="minorBidi"/>
           <w:noProof/>
           <w:color w:val="auto"/>
           <w:kern w:val="2"/>
           <w:sz w:val="22"/>
-          <w14:ligatures w14:val="standardContextual"/>
         </w:rPr>
       </w:pPr>
       <w:hyperlink w:anchor="_Toc243250954" w:history="1">
@@ -1022,7 +1043,6 @@
             <w:color w:val="auto"/>
             <w:kern w:val="2"/>
             <w:sz w:val="22"/>
-            <w14:ligatures w14:val="standardContextual"/>
           </w:rPr>
           <w:tab/>
         </w:r>
@@ -1126,12 +1146,11 @@
           <w:tab w:val="right" w:leader="dot" w:pos="10070"/>
         </w:tabs>
         <w:rPr>
-          <w:rFonts w:asciiTheme="minorHAnsi" w:eastAsiaTheme="minorEastAsia" w:hAnsiTheme="minorHAnsi" w:cstheme="minorBidi" w:hint="eastAsia"/>
+          <w:rFonts w:asciiTheme="minorHAnsi" w:eastAsiaTheme="minorEastAsia" w:hAnsiTheme="minorHAnsi" w:cstheme="minorBidi"/>
           <w:noProof/>
           <w:color w:val="auto"/>
           <w:kern w:val="2"/>
           <w:sz w:val="22"/>
-          <w14:ligatures w14:val="standardContextual"/>
         </w:rPr>
       </w:pPr>
       <w:hyperlink w:anchor="_Toc243250955" w:history="1">
@@ -1149,7 +1168,6 @@
             <w:color w:val="auto"/>
             <w:kern w:val="2"/>
             <w:sz w:val="22"/>
-            <w14:ligatures w14:val="standardContextual"/>
           </w:rPr>
           <w:tab/>
         </w:r>
@@ -1239,12 +1257,11 @@
           <w:tab w:val="right" w:leader="dot" w:pos="10070"/>
         </w:tabs>
         <w:rPr>
-          <w:rFonts w:asciiTheme="minorHAnsi" w:eastAsiaTheme="minorEastAsia" w:hAnsiTheme="minorHAnsi" w:cstheme="minorBidi" w:hint="eastAsia"/>
+          <w:rFonts w:asciiTheme="minorHAnsi" w:eastAsiaTheme="minorEastAsia" w:hAnsiTheme="minorHAnsi" w:cstheme="minorBidi"/>
           <w:noProof/>
           <w:color w:val="auto"/>
           <w:kern w:val="2"/>
           <w:sz w:val="22"/>
-          <w14:ligatures w14:val="standardContextual"/>
         </w:rPr>
       </w:pPr>
       <w:hyperlink w:anchor="_Toc243250956" w:history="1">
@@ -1262,7 +1279,6 @@
             <w:color w:val="auto"/>
             <w:kern w:val="2"/>
             <w:sz w:val="22"/>
-            <w14:ligatures w14:val="standardContextual"/>
           </w:rPr>
           <w:tab/>
         </w:r>
@@ -1352,12 +1368,11 @@
           <w:tab w:val="right" w:leader="dot" w:pos="10070"/>
         </w:tabs>
         <w:rPr>
-          <w:rFonts w:asciiTheme="minorHAnsi" w:eastAsiaTheme="minorEastAsia" w:hAnsiTheme="minorHAnsi" w:cstheme="minorBidi" w:hint="eastAsia"/>
+          <w:rFonts w:asciiTheme="minorHAnsi" w:eastAsiaTheme="minorEastAsia" w:hAnsiTheme="minorHAnsi" w:cstheme="minorBidi"/>
           <w:noProof/>
           <w:color w:val="auto"/>
           <w:kern w:val="2"/>
           <w:sz w:val="22"/>
-          <w14:ligatures w14:val="standardContextual"/>
         </w:rPr>
       </w:pPr>
       <w:hyperlink w:anchor="_Toc243250957" w:history="1">
@@ -1375,7 +1390,6 @@
             <w:color w:val="auto"/>
             <w:kern w:val="2"/>
             <w:sz w:val="22"/>
-            <w14:ligatures w14:val="standardContextual"/>
           </w:rPr>
           <w:tab/>
         </w:r>
@@ -1465,12 +1479,11 @@
           <w:tab w:val="right" w:leader="dot" w:pos="10070"/>
         </w:tabs>
         <w:rPr>
-          <w:rFonts w:asciiTheme="minorHAnsi" w:eastAsiaTheme="minorEastAsia" w:hAnsiTheme="minorHAnsi" w:cstheme="minorBidi" w:hint="eastAsia"/>
+          <w:rFonts w:asciiTheme="minorHAnsi" w:eastAsiaTheme="minorEastAsia" w:hAnsiTheme="minorHAnsi" w:cstheme="minorBidi"/>
           <w:noProof/>
           <w:color w:val="auto"/>
           <w:kern w:val="2"/>
           <w:sz w:val="22"/>
-          <w14:ligatures w14:val="standardContextual"/>
         </w:rPr>
       </w:pPr>
       <w:hyperlink w:anchor="_Toc243250958" w:history="1">
@@ -1488,7 +1501,6 @@
             <w:color w:val="auto"/>
             <w:kern w:val="2"/>
             <w:sz w:val="22"/>
-            <w14:ligatures w14:val="standardContextual"/>
           </w:rPr>
           <w:tab/>
         </w:r>
@@ -1599,12 +1611,11 @@
           <w:tab w:val="right" w:leader="dot" w:pos="10070"/>
         </w:tabs>
         <w:rPr>
-          <w:rFonts w:asciiTheme="minorHAnsi" w:eastAsiaTheme="minorEastAsia" w:hAnsiTheme="minorHAnsi" w:cstheme="minorBidi" w:hint="eastAsia"/>
+          <w:rFonts w:asciiTheme="minorHAnsi" w:eastAsiaTheme="minorEastAsia" w:hAnsiTheme="minorHAnsi" w:cstheme="minorBidi"/>
           <w:noProof/>
           <w:color w:val="auto"/>
           <w:kern w:val="2"/>
           <w:sz w:val="22"/>
-          <w14:ligatures w14:val="standardContextual"/>
         </w:rPr>
       </w:pPr>
       <w:hyperlink w:anchor="_Toc243250959" w:history="1">
@@ -1622,7 +1633,6 @@
             <w:color w:val="auto"/>
             <w:kern w:val="2"/>
             <w:sz w:val="22"/>
-            <w14:ligatures w14:val="standardContextual"/>
           </w:rPr>
           <w:tab/>
         </w:r>
@@ -1712,12 +1722,11 @@
           <w:tab w:val="right" w:leader="dot" w:pos="10070"/>
         </w:tabs>
         <w:rPr>
-          <w:rFonts w:asciiTheme="minorHAnsi" w:eastAsiaTheme="minorEastAsia" w:hAnsiTheme="minorHAnsi" w:cstheme="minorBidi" w:hint="eastAsia"/>
+          <w:rFonts w:asciiTheme="minorHAnsi" w:eastAsiaTheme="minorEastAsia" w:hAnsiTheme="minorHAnsi" w:cstheme="minorBidi"/>
           <w:noProof/>
           <w:color w:val="auto"/>
           <w:kern w:val="2"/>
           <w:sz w:val="22"/>
-          <w14:ligatures w14:val="standardContextual"/>
         </w:rPr>
       </w:pPr>
       <w:hyperlink w:anchor="_Toc243250960" w:history="1">
@@ -1735,7 +1744,6 @@
             <w:color w:val="auto"/>
             <w:kern w:val="2"/>
             <w:sz w:val="22"/>
-            <w14:ligatures w14:val="standardContextual"/>
           </w:rPr>
           <w:tab/>
         </w:r>
@@ -1825,12 +1833,11 @@
           <w:tab w:val="right" w:leader="dot" w:pos="10070"/>
         </w:tabs>
         <w:rPr>
-          <w:rFonts w:asciiTheme="minorHAnsi" w:eastAsiaTheme="minorEastAsia" w:hAnsiTheme="minorHAnsi" w:cstheme="minorBidi" w:hint="eastAsia"/>
+          <w:rFonts w:asciiTheme="minorHAnsi" w:eastAsiaTheme="minorEastAsia" w:hAnsiTheme="minorHAnsi" w:cstheme="minorBidi"/>
           <w:noProof/>
           <w:color w:val="auto"/>
           <w:kern w:val="2"/>
           <w:sz w:val="22"/>
-          <w14:ligatures w14:val="standardContextual"/>
         </w:rPr>
       </w:pPr>
       <w:hyperlink w:anchor="_Toc243250961" w:history="1">
@@ -1848,7 +1855,6 @@
             <w:color w:val="auto"/>
             <w:kern w:val="2"/>
             <w:sz w:val="22"/>
-            <w14:ligatures w14:val="standardContextual"/>
           </w:rPr>
           <w:tab/>
         </w:r>
@@ -1938,12 +1944,11 @@
           <w:tab w:val="right" w:leader="dot" w:pos="10070"/>
         </w:tabs>
         <w:rPr>
-          <w:rFonts w:asciiTheme="minorHAnsi" w:eastAsiaTheme="minorEastAsia" w:hAnsiTheme="minorHAnsi" w:cstheme="minorBidi" w:hint="eastAsia"/>
+          <w:rFonts w:asciiTheme="minorHAnsi" w:eastAsiaTheme="minorEastAsia" w:hAnsiTheme="minorHAnsi" w:cstheme="minorBidi"/>
           <w:noProof/>
           <w:color w:val="auto"/>
           <w:kern w:val="2"/>
           <w:sz w:val="22"/>
-          <w14:ligatures w14:val="standardContextual"/>
         </w:rPr>
       </w:pPr>
       <w:hyperlink w:anchor="_Toc243250962" w:history="1">
@@ -1961,7 +1966,6 @@
             <w:color w:val="auto"/>
             <w:kern w:val="2"/>
             <w:sz w:val="22"/>
-            <w14:ligatures w14:val="standardContextual"/>
           </w:rPr>
           <w:tab/>
         </w:r>
@@ -2072,12 +2076,11 @@
           <w:tab w:val="right" w:leader="dot" w:pos="10070"/>
         </w:tabs>
         <w:rPr>
-          <w:rFonts w:asciiTheme="minorHAnsi" w:eastAsiaTheme="minorEastAsia" w:hAnsiTheme="minorHAnsi" w:cstheme="minorBidi" w:hint="eastAsia"/>
+          <w:rFonts w:asciiTheme="minorHAnsi" w:eastAsiaTheme="minorEastAsia" w:hAnsiTheme="minorHAnsi" w:cstheme="minorBidi"/>
           <w:noProof/>
           <w:color w:val="auto"/>
           <w:kern w:val="2"/>
           <w:sz w:val="22"/>
-          <w14:ligatures w14:val="standardContextual"/>
         </w:rPr>
       </w:pPr>
       <w:hyperlink w:anchor="_Toc243250963" w:history="1">
@@ -2095,7 +2098,6 @@
             <w:color w:val="auto"/>
             <w:kern w:val="2"/>
             <w:sz w:val="22"/>
-            <w14:ligatures w14:val="standardContextual"/>
           </w:rPr>
           <w:tab/>
         </w:r>
@@ -2199,12 +2201,11 @@
           <w:tab w:val="right" w:leader="dot" w:pos="10070"/>
         </w:tabs>
         <w:rPr>
-          <w:rFonts w:asciiTheme="minorHAnsi" w:eastAsiaTheme="minorEastAsia" w:hAnsiTheme="minorHAnsi" w:cstheme="minorBidi" w:hint="eastAsia"/>
+          <w:rFonts w:asciiTheme="minorHAnsi" w:eastAsiaTheme="minorEastAsia" w:hAnsiTheme="minorHAnsi" w:cstheme="minorBidi"/>
           <w:noProof/>
           <w:color w:val="auto"/>
           <w:kern w:val="2"/>
           <w:sz w:val="22"/>
-          <w14:ligatures w14:val="standardContextual"/>
         </w:rPr>
       </w:pPr>
       <w:hyperlink w:anchor="_Toc243250964" w:history="1">
@@ -2222,7 +2223,6 @@
             <w:color w:val="auto"/>
             <w:kern w:val="2"/>
             <w:sz w:val="22"/>
-            <w14:ligatures w14:val="standardContextual"/>
           </w:rPr>
           <w:tab/>
         </w:r>
@@ -2333,12 +2333,11 @@
           <w:tab w:val="right" w:leader="dot" w:pos="10070"/>
         </w:tabs>
         <w:rPr>
-          <w:rFonts w:asciiTheme="minorHAnsi" w:eastAsiaTheme="minorEastAsia" w:hAnsiTheme="minorHAnsi" w:cstheme="minorBidi" w:hint="eastAsia"/>
+          <w:rFonts w:asciiTheme="minorHAnsi" w:eastAsiaTheme="minorEastAsia" w:hAnsiTheme="minorHAnsi" w:cstheme="minorBidi"/>
           <w:noProof/>
           <w:color w:val="auto"/>
           <w:kern w:val="2"/>
           <w:sz w:val="22"/>
-          <w14:ligatures w14:val="standardContextual"/>
         </w:rPr>
       </w:pPr>
       <w:hyperlink w:anchor="_Toc243250965" w:history="1">
@@ -2356,7 +2355,6 @@
             <w:color w:val="auto"/>
             <w:kern w:val="2"/>
             <w:sz w:val="22"/>
-            <w14:ligatures w14:val="standardContextual"/>
           </w:rPr>
           <w:tab/>
         </w:r>
@@ -2453,12 +2451,11 @@
           <w:tab w:val="right" w:leader="dot" w:pos="10070"/>
         </w:tabs>
         <w:rPr>
-          <w:rFonts w:asciiTheme="minorHAnsi" w:eastAsiaTheme="minorEastAsia" w:hAnsiTheme="minorHAnsi" w:cstheme="minorBidi" w:hint="eastAsia"/>
+          <w:rFonts w:asciiTheme="minorHAnsi" w:eastAsiaTheme="minorEastAsia" w:hAnsiTheme="minorHAnsi" w:cstheme="minorBidi"/>
           <w:noProof/>
           <w:color w:val="auto"/>
           <w:kern w:val="2"/>
           <w:sz w:val="22"/>
-          <w14:ligatures w14:val="standardContextual"/>
         </w:rPr>
       </w:pPr>
       <w:hyperlink w:anchor="_Toc243250966" w:history="1">
@@ -2476,7 +2473,6 @@
             <w:color w:val="auto"/>
             <w:kern w:val="2"/>
             <w:sz w:val="22"/>
-            <w14:ligatures w14:val="standardContextual"/>
           </w:rPr>
           <w:tab/>
         </w:r>
@@ -2566,12 +2562,11 @@
           <w:tab w:val="right" w:leader="dot" w:pos="10070"/>
         </w:tabs>
         <w:rPr>
-          <w:rFonts w:asciiTheme="minorHAnsi" w:eastAsiaTheme="minorEastAsia" w:hAnsiTheme="minorHAnsi" w:cstheme="minorBidi" w:hint="eastAsia"/>
+          <w:rFonts w:asciiTheme="minorHAnsi" w:eastAsiaTheme="minorEastAsia" w:hAnsiTheme="minorHAnsi" w:cstheme="minorBidi"/>
           <w:noProof/>
           <w:color w:val="auto"/>
           <w:kern w:val="2"/>
           <w:sz w:val="22"/>
-          <w14:ligatures w14:val="standardContextual"/>
         </w:rPr>
       </w:pPr>
       <w:hyperlink w:anchor="_Toc243250967" w:history="1">
@@ -2589,7 +2584,6 @@
             <w:color w:val="auto"/>
             <w:kern w:val="2"/>
             <w:sz w:val="22"/>
-            <w14:ligatures w14:val="standardContextual"/>
           </w:rPr>
           <w:tab/>
         </w:r>
@@ -2679,12 +2673,11 @@
           <w:tab w:val="right" w:leader="dot" w:pos="10070"/>
         </w:tabs>
         <w:rPr>
-          <w:rFonts w:asciiTheme="minorHAnsi" w:eastAsiaTheme="minorEastAsia" w:hAnsiTheme="minorHAnsi" w:cstheme="minorBidi" w:hint="eastAsia"/>
+          <w:rFonts w:asciiTheme="minorHAnsi" w:eastAsiaTheme="minorEastAsia" w:hAnsiTheme="minorHAnsi" w:cstheme="minorBidi"/>
           <w:noProof/>
           <w:color w:val="auto"/>
           <w:kern w:val="2"/>
           <w:sz w:val="22"/>
-          <w14:ligatures w14:val="standardContextual"/>
         </w:rPr>
       </w:pPr>
       <w:hyperlink w:anchor="_Toc243250968" w:history="1">
@@ -2702,7 +2695,6 @@
             <w:color w:val="auto"/>
             <w:kern w:val="2"/>
             <w:sz w:val="22"/>
-            <w14:ligatures w14:val="standardContextual"/>
           </w:rPr>
           <w:tab/>
         </w:r>
@@ -2792,12 +2784,11 @@
           <w:tab w:val="right" w:leader="dot" w:pos="10070"/>
         </w:tabs>
         <w:rPr>
-          <w:rFonts w:asciiTheme="minorHAnsi" w:eastAsiaTheme="minorEastAsia" w:hAnsiTheme="minorHAnsi" w:cstheme="minorBidi" w:hint="eastAsia"/>
+          <w:rFonts w:asciiTheme="minorHAnsi" w:eastAsiaTheme="minorEastAsia" w:hAnsiTheme="minorHAnsi" w:cstheme="minorBidi"/>
           <w:noProof/>
           <w:color w:val="auto"/>
           <w:kern w:val="2"/>
           <w:sz w:val="22"/>
-          <w14:ligatures w14:val="standardContextual"/>
         </w:rPr>
       </w:pPr>
       <w:hyperlink w:anchor="_Toc243250969" w:history="1">
@@ -2815,7 +2806,6 @@
             <w:color w:val="auto"/>
             <w:kern w:val="2"/>
             <w:sz w:val="22"/>
-            <w14:ligatures w14:val="standardContextual"/>
           </w:rPr>
           <w:tab/>
         </w:r>
@@ -2912,12 +2902,11 @@
           <w:tab w:val="right" w:leader="dot" w:pos="10070"/>
         </w:tabs>
         <w:rPr>
-          <w:rFonts w:asciiTheme="minorHAnsi" w:eastAsiaTheme="minorEastAsia" w:hAnsiTheme="minorHAnsi" w:cstheme="minorBidi" w:hint="eastAsia"/>
+          <w:rFonts w:asciiTheme="minorHAnsi" w:eastAsiaTheme="minorEastAsia" w:hAnsiTheme="minorHAnsi" w:cstheme="minorBidi"/>
           <w:noProof/>
           <w:color w:val="auto"/>
           <w:kern w:val="2"/>
           <w:sz w:val="22"/>
-          <w14:ligatures w14:val="standardContextual"/>
         </w:rPr>
       </w:pPr>
       <w:hyperlink w:anchor="_Toc243250970" w:history="1">
@@ -2935,7 +2924,6 @@
             <w:color w:val="auto"/>
             <w:kern w:val="2"/>
             <w:sz w:val="22"/>
-            <w14:ligatures w14:val="standardContextual"/>
           </w:rPr>
           <w:tab/>
         </w:r>
@@ -3032,12 +3020,11 @@
           <w:tab w:val="right" w:leader="dot" w:pos="10070"/>
         </w:tabs>
         <w:rPr>
-          <w:rFonts w:asciiTheme="minorHAnsi" w:eastAsiaTheme="minorEastAsia" w:hAnsiTheme="minorHAnsi" w:cstheme="minorBidi" w:hint="eastAsia"/>
+          <w:rFonts w:asciiTheme="minorHAnsi" w:eastAsiaTheme="minorEastAsia" w:hAnsiTheme="minorHAnsi" w:cstheme="minorBidi"/>
           <w:noProof/>
           <w:color w:val="auto"/>
           <w:kern w:val="2"/>
           <w:sz w:val="22"/>
-          <w14:ligatures w14:val="standardContextual"/>
         </w:rPr>
       </w:pPr>
       <w:hyperlink w:anchor="_Toc243250971" w:history="1">
@@ -3055,7 +3042,6 @@
             <w:color w:val="auto"/>
             <w:kern w:val="2"/>
             <w:sz w:val="22"/>
-            <w14:ligatures w14:val="standardContextual"/>
           </w:rPr>
           <w:tab/>
         </w:r>
@@ -3145,12 +3131,11 @@
           <w:tab w:val="right" w:leader="dot" w:pos="10070"/>
         </w:tabs>
         <w:rPr>
-          <w:rFonts w:asciiTheme="minorHAnsi" w:eastAsiaTheme="minorEastAsia" w:hAnsiTheme="minorHAnsi" w:cstheme="minorBidi" w:hint="eastAsia"/>
+          <w:rFonts w:asciiTheme="minorHAnsi" w:eastAsiaTheme="minorEastAsia" w:hAnsiTheme="minorHAnsi" w:cstheme="minorBidi"/>
           <w:noProof/>
           <w:color w:val="auto"/>
           <w:kern w:val="2"/>
           <w:sz w:val="22"/>
-          <w14:ligatures w14:val="standardContextual"/>
         </w:rPr>
       </w:pPr>
       <w:hyperlink w:anchor="_Toc243250972" w:history="1">
@@ -3168,7 +3153,6 @@
             <w:color w:val="auto"/>
             <w:kern w:val="2"/>
             <w:sz w:val="22"/>
-            <w14:ligatures w14:val="standardContextual"/>
           </w:rPr>
           <w:tab/>
         </w:r>
@@ -3272,12 +3256,11 @@
           <w:tab w:val="right" w:leader="dot" w:pos="10070"/>
         </w:tabs>
         <w:rPr>
-          <w:rFonts w:asciiTheme="minorHAnsi" w:eastAsiaTheme="minorEastAsia" w:hAnsiTheme="minorHAnsi" w:cstheme="minorBidi" w:hint="eastAsia"/>
+          <w:rFonts w:asciiTheme="minorHAnsi" w:eastAsiaTheme="minorEastAsia" w:hAnsiTheme="minorHAnsi" w:cstheme="minorBidi"/>
           <w:noProof/>
           <w:color w:val="auto"/>
           <w:kern w:val="2"/>
           <w:sz w:val="22"/>
-          <w14:ligatures w14:val="standardContextual"/>
         </w:rPr>
       </w:pPr>
       <w:hyperlink w:anchor="_Toc243250973" w:history="1">
@@ -3295,7 +3278,6 @@
             <w:color w:val="auto"/>
             <w:kern w:val="2"/>
             <w:sz w:val="22"/>
-            <w14:ligatures w14:val="standardContextual"/>
           </w:rPr>
           <w:tab/>
         </w:r>
@@ -3585,7 +3567,15 @@
         <w:t>表</w:t>
       </w:r>
       <w:r>
-        <w:t xml:space="preserve"> 1-1  Zynq </w:t>
+        <w:t xml:space="preserve"> 1-</w:t>
+      </w:r>
+      <w:proofErr w:type="gramStart"/>
+      <w:r>
+        <w:t>1  Zynq</w:t>
+      </w:r>
+      <w:proofErr w:type="gramEnd"/>
+      <w:r>
+        <w:t xml:space="preserve"> </w:t>
       </w:r>
       <w:r>
         <w:t>项目最低启动清单</w:t>
@@ -3944,7 +3934,21 @@
               <w:rPr>
                 <w:sz w:val="16"/>
               </w:rPr>
-              <w:t xml:space="preserve"> GND/Vref/TMS/TCK/TDI/TDO</w:t>
+              <w:t xml:space="preserve"> GND/</w:t>
+            </w:r>
+            <w:proofErr w:type="spellStart"/>
+            <w:r>
+              <w:rPr>
+                <w:sz w:val="16"/>
+              </w:rPr>
+              <w:t>Vref</w:t>
+            </w:r>
+            <w:proofErr w:type="spellEnd"/>
+            <w:r>
+              <w:rPr>
+                <w:sz w:val="16"/>
+              </w:rPr>
+              <w:t>/TMS/TCK/TDI/TDO</w:t>
             </w:r>
             <w:r>
               <w:rPr>
@@ -4642,11 +4646,16 @@
         <w:t>表</w:t>
       </w:r>
       <w:r>
-        <w:t xml:space="preserve"> 1-2  </w:t>
+        <w:t xml:space="preserve"> 1-</w:t>
+      </w:r>
+      <w:proofErr w:type="gramStart"/>
+      <w:r>
+        <w:t xml:space="preserve">2  </w:t>
       </w:r>
       <w:r>
         <w:t>课程扩展可选器材</w:t>
       </w:r>
+      <w:proofErr w:type="gramEnd"/>
     </w:p>
     <w:tbl>
       <w:tblPr>
@@ -6201,8 +6210,13 @@
         <w:t>和</w:t>
       </w:r>
       <w:r>
-        <w:t xml:space="preserve"> Vref</w:t>
-      </w:r>
+        <w:t xml:space="preserve"> </w:t>
+      </w:r>
+      <w:proofErr w:type="spellStart"/>
+      <w:r>
+        <w:t>Vref</w:t>
+      </w:r>
+      <w:proofErr w:type="spellEnd"/>
       <w:r>
         <w:t>，不确定时用万用表测通断，不要直接上电。</w:t>
       </w:r>
@@ -6507,7 +6521,15 @@
         <w:t>表</w:t>
       </w:r>
       <w:r>
-        <w:t xml:space="preserve"> 2-1  2 </w:t>
+        <w:t xml:space="preserve"> 2-</w:t>
+      </w:r>
+      <w:proofErr w:type="gramStart"/>
+      <w:r>
+        <w:t>1  2</w:t>
+      </w:r>
+      <w:proofErr w:type="gramEnd"/>
+      <w:r>
+        <w:t xml:space="preserve"> </w:t>
       </w:r>
       <w:r>
         <w:t>周并行入门路线（只学必要章节）</w:t>
@@ -7589,11 +7611,19 @@
               </w:rPr>
               <w:t>、</w:t>
             </w:r>
+            <w:proofErr w:type="spellStart"/>
             <w:r>
               <w:rPr>
                 <w:sz w:val="17"/>
               </w:rPr>
-              <w:t xml:space="preserve">shellCommand </w:t>
+              <w:t>shellCommand</w:t>
+            </w:r>
+            <w:proofErr w:type="spellEnd"/>
+            <w:r>
+              <w:rPr>
+                <w:sz w:val="17"/>
+              </w:rPr>
+              <w:t xml:space="preserve"> </w:t>
             </w:r>
             <w:r>
               <w:rPr>
@@ -8172,6 +8202,7 @@
         </w:rPr>
         <w:t xml:space="preserve">  ·  Python</w:t>
       </w:r>
+      <w:proofErr w:type="gramStart"/>
       <w:r>
         <w:rPr>
           <w:color w:val="4B5563"/>
@@ -8184,7 +8215,15 @@
           <w:color w:val="4B5563"/>
           <w:sz w:val="18"/>
         </w:rPr>
-        <w:t xml:space="preserve">  |  39:58:14</w:t>
+        <w:t xml:space="preserve">  |</w:t>
+      </w:r>
+      <w:proofErr w:type="gramEnd"/>
+      <w:r>
+        <w:rPr>
+          <w:color w:val="4B5563"/>
+          <w:sz w:val="18"/>
+        </w:rPr>
+        <w:t xml:space="preserve">  39:58:14</w:t>
       </w:r>
     </w:p>
     <w:p>
@@ -8444,7 +8483,15 @@
         <w:t>。课程中同一主题存在不同</w:t>
       </w:r>
       <w:r>
-        <w:t xml:space="preserve"> Vivado </w:t>
+        <w:t xml:space="preserve"> </w:t>
+      </w:r>
+      <w:proofErr w:type="spellStart"/>
+      <w:r>
+        <w:t>Vivado</w:t>
+      </w:r>
+      <w:proofErr w:type="spellEnd"/>
+      <w:r>
+        <w:t xml:space="preserve"> </w:t>
       </w:r>
       <w:r>
         <w:t>版本，选择与你环境最接近的一套即可，不要重复看两遍。</w:t>
@@ -8535,8 +8582,13 @@
       <w:r>
         <w:t>、</w:t>
       </w:r>
-      <w:r>
-        <w:t xml:space="preserve">shellCommand </w:t>
+      <w:proofErr w:type="spellStart"/>
+      <w:r>
+        <w:t>shellCommand</w:t>
+      </w:r>
+      <w:proofErr w:type="spellEnd"/>
+      <w:r>
+        <w:t xml:space="preserve"> </w:t>
       </w:r>
       <w:r>
         <w:t>链接段、命令表和</w:t>
@@ -8769,7 +8821,15 @@
         <w:t>遇到课程版本差异时，以当前工程的</w:t>
       </w:r>
       <w:r>
-        <w:t xml:space="preserve"> Vivado 2018.3</w:t>
+        <w:t xml:space="preserve"> </w:t>
+      </w:r>
+      <w:proofErr w:type="spellStart"/>
+      <w:r>
+        <w:t>Vivado</w:t>
+      </w:r>
+      <w:proofErr w:type="spellEnd"/>
+      <w:r>
+        <w:t xml:space="preserve"> 2018.3</w:t>
       </w:r>
       <w:r>
         <w:t>、</w:t>
@@ -8912,7 +8972,15 @@
         <w:t>能在</w:t>
       </w:r>
       <w:r>
-        <w:t xml:space="preserve"> Vivado </w:t>
+        <w:t xml:space="preserve"> </w:t>
+      </w:r>
+      <w:proofErr w:type="spellStart"/>
+      <w:r>
+        <w:t>Vivado</w:t>
+      </w:r>
+      <w:proofErr w:type="spellEnd"/>
+      <w:r>
+        <w:t xml:space="preserve"> </w:t>
       </w:r>
       <w:r>
         <w:t>中建立工程、添加约束、生成比特流，并让</w:t>
@@ -9204,8 +9272,13 @@
       <w:r>
         <w:t>本章把开发板检查、</w:t>
       </w:r>
-      <w:r>
-        <w:t xml:space="preserve">Vivado </w:t>
+      <w:proofErr w:type="spellStart"/>
+      <w:r>
+        <w:t>Vivado</w:t>
+      </w:r>
+      <w:proofErr w:type="spellEnd"/>
+      <w:r>
+        <w:t xml:space="preserve"> </w:t>
       </w:r>
       <w:r>
         <w:t>配置、</w:t>
@@ -9382,6 +9455,9 @@
     <w:p>
       <w:pPr>
         <w:pStyle w:val="a0"/>
+        <w:rPr>
+          <w:rFonts w:hint="eastAsia"/>
+        </w:rPr>
       </w:pPr>
       <w:r>
         <w:rPr>
@@ -9478,41 +9554,6 @@
           <w:rFonts w:hint="eastAsia"/>
         </w:rPr>
         <w:t>呈现出闪烁或调光效果。</w:t>
-      </w:r>
-    </w:p>
-    <w:p>
-      <w:pPr>
-        <w:pStyle w:val="a0"/>
-      </w:pPr>
-      <w:r>
-        <w:rPr>
-          <w:rFonts w:hint="eastAsia"/>
-        </w:rPr>
-        <w:t>这部分详细可看《</w:t>
-      </w:r>
-      <w:r>
-        <w:rPr>
-          <w:rFonts w:hint="eastAsia"/>
-        </w:rPr>
-        <w:t>ZYNQ</w:t>
-      </w:r>
-      <w:r>
-        <w:rPr>
-          <w:rFonts w:hint="eastAsia"/>
-        </w:rPr>
-        <w:t>硬件</w:t>
-      </w:r>
-      <w:r>
-        <w:rPr>
-          <w:rFonts w:hint="eastAsia"/>
-        </w:rPr>
-        <w:t>-</w:t>
-      </w:r>
-      <w:r>
-        <w:rPr>
-          <w:rFonts w:hint="eastAsia"/>
-        </w:rPr>
-        <w:t>以规培为例》。</w:t>
       </w:r>
     </w:p>
     <w:p>
@@ -9578,15 +9619,19 @@
         <w:pStyle w:val="TableCaption"/>
       </w:pPr>
       <w:r>
-        <w:lastRenderedPageBreak/>
         <w:t>表</w:t>
       </w:r>
       <w:r>
-        <w:t xml:space="preserve"> 3-1  </w:t>
+        <w:t xml:space="preserve"> 3-</w:t>
+      </w:r>
+      <w:proofErr w:type="gramStart"/>
+      <w:r>
+        <w:t xml:space="preserve">1  </w:t>
       </w:r>
       <w:r>
         <w:t>术语与官方资料索引</w:t>
       </w:r>
+      <w:proofErr w:type="gramEnd"/>
     </w:p>
     <w:tbl>
       <w:tblPr>
@@ -10163,11 +10208,19 @@
             <w:pPr>
               <w:spacing w:after="0" w:line="247" w:lineRule="auto"/>
             </w:pPr>
+            <w:proofErr w:type="spellStart"/>
             <w:r>
               <w:rPr>
                 <w:sz w:val="16"/>
               </w:rPr>
-              <w:t xml:space="preserve">Vivado </w:t>
+              <w:t>Vivado</w:t>
+            </w:r>
+            <w:proofErr w:type="spellEnd"/>
+            <w:r>
+              <w:rPr>
+                <w:sz w:val="16"/>
+              </w:rPr>
+              <w:t xml:space="preserve"> </w:t>
             </w:r>
             <w:r>
               <w:rPr>
@@ -10335,8 +10388,16 @@
               <w:rPr>
                 <w:sz w:val="16"/>
               </w:rPr>
-              <w:t xml:space="preserve"> led_ctl</w:t>
-            </w:r>
+              <w:t xml:space="preserve"> </w:t>
+            </w:r>
+            <w:proofErr w:type="spellStart"/>
+            <w:r>
+              <w:rPr>
+                <w:sz w:val="16"/>
+              </w:rPr>
+              <w:t>led_ctl</w:t>
+            </w:r>
+            <w:proofErr w:type="spellEnd"/>
             <w:r>
               <w:rPr>
                 <w:sz w:val="16"/>
@@ -10826,7 +10887,21 @@
               <w:rPr>
                 <w:sz w:val="16"/>
               </w:rPr>
-              <w:t xml:space="preserve"> shellCommand </w:t>
+              <w:t xml:space="preserve"> </w:t>
+            </w:r>
+            <w:proofErr w:type="spellStart"/>
+            <w:r>
+              <w:rPr>
+                <w:sz w:val="16"/>
+              </w:rPr>
+              <w:t>shellCommand</w:t>
+            </w:r>
+            <w:proofErr w:type="spellEnd"/>
+            <w:r>
+              <w:rPr>
+                <w:sz w:val="16"/>
+              </w:rPr>
+              <w:t xml:space="preserve"> </w:t>
             </w:r>
             <w:r>
               <w:rPr>
@@ -10908,7 +10983,14 @@
         <w:rPr>
           <w:rFonts w:hint="eastAsia"/>
         </w:rPr>
-        <w:t>处理系统</w:t>
+        <w:t>处理</w:t>
+      </w:r>
+      <w:proofErr w:type="gramStart"/>
+      <w:r>
+        <w:rPr>
+          <w:rFonts w:hint="eastAsia"/>
+        </w:rPr>
+        <w:t>系统</w:t>
       </w:r>
       <w:r>
         <w:rPr>
@@ -10916,6 +10998,7 @@
         </w:rPr>
         <w:t>,</w:t>
       </w:r>
+      <w:proofErr w:type="gramEnd"/>
       <w:r>
         <w:rPr>
           <w:rFonts w:hint="eastAsia"/>
@@ -11000,6 +11083,7 @@
         </w:rPr>
         <w:t>是</w:t>
       </w:r>
+      <w:proofErr w:type="gramStart"/>
       <w:r>
         <w:rPr>
           <w:rFonts w:hint="eastAsia"/>
@@ -11018,6 +11102,7 @@
         </w:rPr>
         <w:t>",</w:t>
       </w:r>
+      <w:proofErr w:type="gramEnd"/>
       <w:r>
         <w:rPr>
           <w:rFonts w:hint="eastAsia"/>
@@ -11075,7 +11160,14 @@
         <w:rPr>
           <w:rFonts w:hint="eastAsia"/>
         </w:rPr>
-        <w:t>可编程逻辑</w:t>
+        <w:t>可编程</w:t>
+      </w:r>
+      <w:proofErr w:type="gramStart"/>
+      <w:r>
+        <w:rPr>
+          <w:rFonts w:hint="eastAsia"/>
+        </w:rPr>
+        <w:t>逻辑</w:t>
       </w:r>
       <w:r>
         <w:rPr>
@@ -11083,6 +11175,7 @@
         </w:rPr>
         <w:t>,</w:t>
       </w:r>
+      <w:proofErr w:type="gramEnd"/>
       <w:r>
         <w:rPr>
           <w:rFonts w:hint="eastAsia"/>
@@ -11110,6 +11203,7 @@
       <w:r>
         <w:t xml:space="preserve"> Artix-7 </w:t>
       </w:r>
+      <w:proofErr w:type="gramStart"/>
       <w:r>
         <w:rPr>
           <w:rFonts w:hint="eastAsia"/>
@@ -11122,6 +11216,7 @@
         </w:rPr>
         <w:t>,</w:t>
       </w:r>
+      <w:proofErr w:type="gramEnd"/>
       <w:r>
         <w:rPr>
           <w:rFonts w:hint="eastAsia"/>
@@ -11146,6 +11241,7 @@
         </w:rPr>
         <w:t>是</w:t>
       </w:r>
+      <w:proofErr w:type="gramStart"/>
       <w:r>
         <w:rPr>
           <w:rFonts w:hint="eastAsia"/>
@@ -11164,6 +11260,7 @@
         </w:rPr>
         <w:t>",</w:t>
       </w:r>
+      <w:proofErr w:type="gramEnd"/>
       <w:r>
         <w:rPr>
           <w:rFonts w:hint="eastAsia"/>
@@ -11201,7 +11298,15 @@
         <w:pStyle w:val="FirstParagraph"/>
       </w:pPr>
       <w:r>
-        <w:t>Advanced eXtensible Interface</w:t>
+        <w:t xml:space="preserve">Advanced </w:t>
+      </w:r>
+      <w:proofErr w:type="spellStart"/>
+      <w:r>
+        <w:t>eXtensible</w:t>
+      </w:r>
+      <w:proofErr w:type="spellEnd"/>
+      <w:r>
+        <w:t xml:space="preserve"> Interface</w:t>
       </w:r>
     </w:p>
     <w:p>
@@ -11215,7 +11320,14 @@
         <w:rPr>
           <w:rFonts w:hint="eastAsia"/>
         </w:rPr>
-        <w:t>公司提出的片上总线协议</w:t>
+        <w:t>公司提出的片上总线</w:t>
+      </w:r>
+      <w:proofErr w:type="gramStart"/>
+      <w:r>
+        <w:rPr>
+          <w:rFonts w:hint="eastAsia"/>
+        </w:rPr>
+        <w:t>协议</w:t>
       </w:r>
       <w:r>
         <w:rPr>
@@ -11223,6 +11335,7 @@
         </w:rPr>
         <w:t>,</w:t>
       </w:r>
+      <w:proofErr w:type="gramEnd"/>
       <w:r>
         <w:rPr>
           <w:rFonts w:hint="eastAsia"/>
@@ -11329,7 +11442,6 @@
           <w:rFonts w:eastAsia="微软雅黑" w:cs="Noto Sans"/>
           <w:color w:val="007C8A"/>
         </w:rPr>
-        <w:lastRenderedPageBreak/>
         <w:t>3.2.4</w:t>
       </w:r>
       <w:r>
@@ -11351,7 +11463,15 @@
         <w:pStyle w:val="FirstParagraph"/>
       </w:pPr>
       <w:r>
-        <w:t>Advanced eXtensible Interface Lite</w:t>
+        <w:t xml:space="preserve">Advanced </w:t>
+      </w:r>
+      <w:proofErr w:type="spellStart"/>
+      <w:r>
+        <w:t>eXtensible</w:t>
+      </w:r>
+      <w:proofErr w:type="spellEnd"/>
+      <w:r>
+        <w:t xml:space="preserve"> Interface Lite</w:t>
       </w:r>
     </w:p>
     <w:p>
@@ -11359,13 +11479,21 @@
         <w:pStyle w:val="a0"/>
       </w:pPr>
       <w:r>
+        <w:lastRenderedPageBreak/>
         <w:t xml:space="preserve">AXI </w:t>
       </w:r>
       <w:r>
         <w:rPr>
           <w:rFonts w:hint="eastAsia"/>
         </w:rPr>
-        <w:t>总线的轻量子集</w:t>
+        <w:t>总线的轻量子</w:t>
+      </w:r>
+      <w:proofErr w:type="gramStart"/>
+      <w:r>
+        <w:rPr>
+          <w:rFonts w:hint="eastAsia"/>
+        </w:rPr>
+        <w:t>集</w:t>
       </w:r>
       <w:r>
         <w:rPr>
@@ -11373,6 +11501,7 @@
         </w:rPr>
         <w:t>,</w:t>
       </w:r>
+      <w:proofErr w:type="gramEnd"/>
       <w:r>
         <w:rPr>
           <w:rFonts w:hint="eastAsia"/>
@@ -11437,7 +11566,14 @@
         <w:rPr>
           <w:rFonts w:hint="eastAsia"/>
         </w:rPr>
-        <w:t>适合低速、控制类应用</w:t>
+        <w:t>适合低速、控制类</w:t>
+      </w:r>
+      <w:proofErr w:type="gramStart"/>
+      <w:r>
+        <w:rPr>
+          <w:rFonts w:hint="eastAsia"/>
+        </w:rPr>
+        <w:t>应用</w:t>
       </w:r>
       <w:r>
         <w:rPr>
@@ -11445,6 +11581,7 @@
         </w:rPr>
         <w:t>,</w:t>
       </w:r>
+      <w:proofErr w:type="gramEnd"/>
       <w:r>
         <w:rPr>
           <w:rFonts w:hint="eastAsia"/>
@@ -11517,7 +11654,14 @@
         <w:rPr>
           <w:rFonts w:hint="eastAsia"/>
         </w:rPr>
-        <w:t>一种通过串口与用户交互的命令行界面。用户输入命令字符串</w:t>
+        <w:t>一种通过串口与用户交互的命令行界面。用户输入命令</w:t>
+      </w:r>
+      <w:proofErr w:type="gramStart"/>
+      <w:r>
+        <w:rPr>
+          <w:rFonts w:hint="eastAsia"/>
+        </w:rPr>
+        <w:t>字符串</w:t>
       </w:r>
       <w:r>
         <w:rPr>
@@ -11525,11 +11669,19 @@
         </w:rPr>
         <w:t>,</w:t>
       </w:r>
-      <w:r>
-        <w:rPr>
-          <w:rFonts w:hint="eastAsia"/>
-        </w:rPr>
-        <w:t>系统解析并执行对应操作</w:t>
+      <w:proofErr w:type="gramEnd"/>
+      <w:r>
+        <w:rPr>
+          <w:rFonts w:hint="eastAsia"/>
+        </w:rPr>
+        <w:t>系统解析并执行对应</w:t>
+      </w:r>
+      <w:proofErr w:type="gramStart"/>
+      <w:r>
+        <w:rPr>
+          <w:rFonts w:hint="eastAsia"/>
+        </w:rPr>
+        <w:t>操作</w:t>
       </w:r>
       <w:r>
         <w:rPr>
@@ -11537,6 +11689,7 @@
         </w:rPr>
         <w:t>,</w:t>
       </w:r>
+      <w:proofErr w:type="gramEnd"/>
       <w:r>
         <w:rPr>
           <w:rFonts w:hint="eastAsia"/>
@@ -11636,8 +11789,13 @@
       <w:pPr>
         <w:pStyle w:val="FirstParagraph"/>
       </w:pPr>
-      <w:r>
-        <w:t xml:space="preserve">Vivado </w:t>
+      <w:proofErr w:type="spellStart"/>
+      <w:r>
+        <w:t>Vivado</w:t>
+      </w:r>
+      <w:proofErr w:type="spellEnd"/>
+      <w:r>
+        <w:t xml:space="preserve"> </w:t>
       </w:r>
       <w:r>
         <w:rPr>
@@ -11652,7 +11810,14 @@
         <w:rPr>
           <w:rFonts w:hint="eastAsia"/>
         </w:rPr>
-        <w:t>集成方式。通过拖拽和连线的方式</w:t>
+        <w:t>集成方式。通过拖拽和连线的</w:t>
+      </w:r>
+      <w:proofErr w:type="gramStart"/>
+      <w:r>
+        <w:rPr>
+          <w:rFonts w:hint="eastAsia"/>
+        </w:rPr>
+        <w:t>方式</w:t>
       </w:r>
       <w:r>
         <w:rPr>
@@ -11660,6 +11825,7 @@
         </w:rPr>
         <w:t>,</w:t>
       </w:r>
+      <w:proofErr w:type="gramEnd"/>
       <w:r>
         <w:rPr>
           <w:rFonts w:hint="eastAsia"/>
@@ -11688,7 +11854,14 @@
         <w:rPr>
           <w:rFonts w:hint="eastAsia"/>
         </w:rPr>
-        <w:t>等模块连接起来</w:t>
+        <w:t>等模块连接</w:t>
+      </w:r>
+      <w:proofErr w:type="gramStart"/>
+      <w:r>
+        <w:rPr>
+          <w:rFonts w:hint="eastAsia"/>
+        </w:rPr>
+        <w:t>起来</w:t>
       </w:r>
       <w:r>
         <w:rPr>
@@ -11696,6 +11869,7 @@
         </w:rPr>
         <w:t>,</w:t>
       </w:r>
+      <w:proofErr w:type="gramEnd"/>
       <w:r>
         <w:t xml:space="preserve"> </w:t>
       </w:r>
@@ -11767,7 +11941,14 @@
         <w:rPr>
           <w:rFonts w:hint="eastAsia"/>
         </w:rPr>
-        <w:t>使用板子时要解决三个问题</w:t>
+        <w:t>使用板子时要解决三个</w:t>
+      </w:r>
+      <w:proofErr w:type="gramStart"/>
+      <w:r>
+        <w:rPr>
+          <w:rFonts w:hint="eastAsia"/>
+        </w:rPr>
+        <w:t>问题</w:t>
       </w:r>
       <w:r>
         <w:rPr>
@@ -11775,6 +11956,7 @@
         </w:rPr>
         <w:t>,</w:t>
       </w:r>
+      <w:proofErr w:type="gramEnd"/>
       <w:r>
         <w:rPr>
           <w:rFonts w:hint="eastAsia"/>
@@ -11791,7 +11973,14 @@
         <w:rPr>
           <w:rFonts w:hint="eastAsia"/>
         </w:rPr>
-        <w:t>的连接</w:t>
+        <w:t>的</w:t>
+      </w:r>
+      <w:proofErr w:type="gramStart"/>
+      <w:r>
+        <w:rPr>
+          <w:rFonts w:hint="eastAsia"/>
+        </w:rPr>
+        <w:t>连接</w:t>
       </w:r>
       <w:r>
         <w:rPr>
@@ -11799,11 +11988,19 @@
         </w:rPr>
         <w:t>,</w:t>
       </w:r>
-      <w:r>
-        <w:rPr>
-          <w:rFonts w:hint="eastAsia"/>
-        </w:rPr>
-        <w:t>如有不慎会出现以下报错</w:t>
+      <w:proofErr w:type="gramEnd"/>
+      <w:r>
+        <w:rPr>
+          <w:rFonts w:hint="eastAsia"/>
+        </w:rPr>
+        <w:t>如有不慎会出现以下报</w:t>
+      </w:r>
+      <w:proofErr w:type="gramStart"/>
+      <w:r>
+        <w:rPr>
+          <w:rFonts w:hint="eastAsia"/>
+        </w:rPr>
+        <w:t>错</w:t>
       </w:r>
       <w:r>
         <w:rPr>
@@ -11811,6 +12008,7 @@
         </w:rPr>
         <w:t>:</w:t>
       </w:r>
+      <w:proofErr w:type="gramEnd"/>
     </w:p>
     <w:tbl>
       <w:tblPr>
@@ -12053,7 +12251,14 @@
         <w:rPr>
           <w:rFonts w:hint="eastAsia"/>
         </w:rPr>
-        <w:t>接口处有专门的电源供电</w:t>
+        <w:t>接口处有专门的电源</w:t>
+      </w:r>
+      <w:proofErr w:type="gramStart"/>
+      <w:r>
+        <w:rPr>
+          <w:rFonts w:hint="eastAsia"/>
+        </w:rPr>
+        <w:t>供电</w:t>
       </w:r>
       <w:r>
         <w:rPr>
@@ -12061,6 +12266,7 @@
         </w:rPr>
         <w:t>,</w:t>
       </w:r>
+      <w:proofErr w:type="gramEnd"/>
       <w:r>
         <w:rPr>
           <w:rFonts w:hint="eastAsia"/>
@@ -12073,6 +12279,7 @@
         </w:rPr>
         <w:t>6pin</w:t>
       </w:r>
+      <w:proofErr w:type="gramStart"/>
       <w:r>
         <w:rPr>
           <w:rFonts w:hint="eastAsia"/>
@@ -12085,6 +12292,7 @@
         </w:rPr>
         <w:t>,</w:t>
       </w:r>
+      <w:proofErr w:type="gramEnd"/>
       <w:r>
         <w:rPr>
           <w:rFonts w:hint="eastAsia"/>
@@ -12101,7 +12309,14 @@
         <w:rPr>
           <w:rFonts w:hint="eastAsia"/>
         </w:rPr>
-        <w:t>需要导通</w:t>
+        <w:t>需要导</w:t>
+      </w:r>
+      <w:proofErr w:type="gramStart"/>
+      <w:r>
+        <w:rPr>
+          <w:rFonts w:hint="eastAsia"/>
+        </w:rPr>
+        <w:t>通</w:t>
       </w:r>
       <w:r>
         <w:rPr>
@@ -12109,6 +12324,7 @@
         </w:rPr>
         <w:t>,</w:t>
       </w:r>
+      <w:proofErr w:type="gramEnd"/>
       <w:r>
         <w:rPr>
           <w:rFonts w:hint="eastAsia"/>
@@ -12136,7 +12352,14 @@
         <w:rPr>
           <w:rFonts w:hint="eastAsia"/>
         </w:rPr>
-        <w:t>的引脚进行供电</w:t>
+        <w:t>的引脚进行</w:t>
+      </w:r>
+      <w:proofErr w:type="gramStart"/>
+      <w:r>
+        <w:rPr>
+          <w:rFonts w:hint="eastAsia"/>
+        </w:rPr>
+        <w:t>供电</w:t>
       </w:r>
       <w:r>
         <w:rPr>
@@ -12144,6 +12367,7 @@
         </w:rPr>
         <w:t>,</w:t>
       </w:r>
+      <w:proofErr w:type="gramEnd"/>
       <w:r>
         <w:rPr>
           <w:rFonts w:hint="eastAsia"/>
@@ -12210,6 +12434,7 @@
         </w:rPr>
         <w:t>保证输出的电压可以供板子。</w:t>
       </w:r>
+      <w:proofErr w:type="gramStart"/>
       <w:r>
         <w:rPr>
           <w:rFonts w:hint="eastAsia"/>
@@ -12220,7 +12445,21 @@
         <w:rPr>
           <w:rFonts w:hint="eastAsia"/>
         </w:rPr>
-        <w:t>不建议使用后者</w:t>
+        <w:t>不</w:t>
+      </w:r>
+      <w:proofErr w:type="gramEnd"/>
+      <w:r>
+        <w:rPr>
+          <w:rFonts w:hint="eastAsia"/>
+        </w:rPr>
+        <w:t>建议使用</w:t>
+      </w:r>
+      <w:proofErr w:type="gramStart"/>
+      <w:r>
+        <w:rPr>
+          <w:rFonts w:hint="eastAsia"/>
+        </w:rPr>
+        <w:t>后者</w:t>
       </w:r>
       <w:r>
         <w:rPr>
@@ -12228,11 +12467,19 @@
         </w:rPr>
         <w:t>,</w:t>
       </w:r>
-      <w:r>
-        <w:rPr>
-          <w:rFonts w:hint="eastAsia"/>
-        </w:rPr>
-        <w:t>使用前者</w:t>
+      <w:proofErr w:type="gramEnd"/>
+      <w:r>
+        <w:rPr>
+          <w:rFonts w:hint="eastAsia"/>
+        </w:rPr>
+        <w:t>使用</w:t>
+      </w:r>
+      <w:proofErr w:type="gramStart"/>
+      <w:r>
+        <w:rPr>
+          <w:rFonts w:hint="eastAsia"/>
+        </w:rPr>
+        <w:t>前者</w:t>
       </w:r>
       <w:r>
         <w:rPr>
@@ -12240,6 +12487,7 @@
         </w:rPr>
         <w:t>)</w:t>
       </w:r>
+      <w:proofErr w:type="gramEnd"/>
     </w:p>
     <w:p>
       <w:pPr>
@@ -12274,7 +12522,14 @@
         <w:rPr>
           <w:rFonts w:hint="eastAsia"/>
         </w:rPr>
-        <w:t>在板子买回来后</w:t>
+        <w:t>在板子买回来</w:t>
+      </w:r>
+      <w:proofErr w:type="gramStart"/>
+      <w:r>
+        <w:rPr>
+          <w:rFonts w:hint="eastAsia"/>
+        </w:rPr>
+        <w:t>后</w:t>
       </w:r>
       <w:r>
         <w:rPr>
@@ -12282,6 +12537,7 @@
         </w:rPr>
         <w:t>,</w:t>
       </w:r>
+      <w:proofErr w:type="gramEnd"/>
       <w:r>
         <w:rPr>
           <w:rFonts w:hint="eastAsia"/>
@@ -12298,7 +12554,14 @@
         <w:rPr>
           <w:rFonts w:hint="eastAsia"/>
         </w:rPr>
-        <w:t>是空的</w:t>
+        <w:t>是空</w:t>
+      </w:r>
+      <w:proofErr w:type="gramStart"/>
+      <w:r>
+        <w:rPr>
+          <w:rFonts w:hint="eastAsia"/>
+        </w:rPr>
+        <w:t>的</w:t>
       </w:r>
       <w:r>
         <w:rPr>
@@ -12306,6 +12569,7 @@
         </w:rPr>
         <w:t>,</w:t>
       </w:r>
+      <w:proofErr w:type="gramEnd"/>
       <w:r>
         <w:rPr>
           <w:rFonts w:hint="eastAsia"/>
@@ -12369,12 +12633,15 @@
         </w:rPr>
         <w:t>不同于</w:t>
       </w:r>
+      <w:proofErr w:type="spellStart"/>
       <w:r>
         <w:rPr>
           <w:rFonts w:hint="eastAsia"/>
         </w:rPr>
         <w:t>typeC</w:t>
       </w:r>
+      <w:proofErr w:type="spellEnd"/>
+      <w:proofErr w:type="gramStart"/>
       <w:r>
         <w:rPr>
           <w:rFonts w:hint="eastAsia"/>
@@ -12387,6 +12654,7 @@
         </w:rPr>
         <w:t>,</w:t>
       </w:r>
+      <w:proofErr w:type="gramEnd"/>
       <w:r>
         <w:rPr>
           <w:rFonts w:hint="eastAsia"/>
@@ -12438,7 +12706,14 @@
         <w:rPr>
           <w:rFonts w:hint="eastAsia"/>
         </w:rPr>
-        <w:t>的排针焊接完</w:t>
+        <w:t>的排针焊接</w:t>
+      </w:r>
+      <w:proofErr w:type="gramStart"/>
+      <w:r>
+        <w:rPr>
+          <w:rFonts w:hint="eastAsia"/>
+        </w:rPr>
+        <w:t>完</w:t>
       </w:r>
       <w:r>
         <w:rPr>
@@ -12446,11 +12721,19 @@
         </w:rPr>
         <w:t>,</w:t>
       </w:r>
-      <w:r>
-        <w:rPr>
-          <w:rFonts w:hint="eastAsia"/>
-        </w:rPr>
-        <w:t>买下载器</w:t>
+      <w:proofErr w:type="gramEnd"/>
+      <w:r>
+        <w:rPr>
+          <w:rFonts w:hint="eastAsia"/>
+        </w:rPr>
+        <w:t>买下载</w:t>
+      </w:r>
+      <w:proofErr w:type="gramStart"/>
+      <w:r>
+        <w:rPr>
+          <w:rFonts w:hint="eastAsia"/>
+        </w:rPr>
+        <w:t>器</w:t>
       </w:r>
       <w:r>
         <w:rPr>
@@ -12458,12 +12741,14 @@
         </w:rPr>
         <w:t>,</w:t>
       </w:r>
+      <w:proofErr w:type="gramEnd"/>
       <w:r>
         <w:rPr>
           <w:rFonts w:hint="eastAsia"/>
         </w:rPr>
         <w:t>将排线和接口对齐接上。注意下载器的排线两头间距要适配焊的排针间距</w:t>
       </w:r>
+      <w:proofErr w:type="gramStart"/>
       <w:r>
         <w:rPr>
           <w:rFonts w:hint="eastAsia"/>
@@ -12480,7 +12765,14 @@
         <w:rPr>
           <w:rFonts w:hint="eastAsia"/>
         </w:rPr>
-        <w:t>2.54mm),</w:t>
+        <w:t>2.54mm)</w:t>
+      </w:r>
+      <w:proofErr w:type="gramEnd"/>
+      <w:r>
+        <w:rPr>
+          <w:rFonts w:hint="eastAsia"/>
+        </w:rPr>
+        <w:t>,</w:t>
       </w:r>
       <w:r>
         <w:rPr>
@@ -12500,17 +12792,26 @@
         </w:rPr>
         <w:t>和</w:t>
       </w:r>
+      <w:proofErr w:type="spellStart"/>
       <w:r>
         <w:rPr>
           <w:rFonts w:hint="eastAsia"/>
         </w:rPr>
         <w:t>Vref</w:t>
       </w:r>
-      <w:r>
-        <w:rPr>
-          <w:rFonts w:hint="eastAsia"/>
-        </w:rPr>
-        <w:t>不要接反</w:t>
+      <w:proofErr w:type="spellEnd"/>
+      <w:r>
+        <w:rPr>
+          <w:rFonts w:hint="eastAsia"/>
+        </w:rPr>
+        <w:t>不要接</w:t>
+      </w:r>
+      <w:proofErr w:type="gramStart"/>
+      <w:r>
+        <w:rPr>
+          <w:rFonts w:hint="eastAsia"/>
+        </w:rPr>
+        <w:t>反</w:t>
       </w:r>
       <w:r>
         <w:rPr>
@@ -12518,6 +12819,7 @@
         </w:rPr>
         <w:t>,</w:t>
       </w:r>
+      <w:proofErr w:type="gramEnd"/>
       <w:r>
         <w:rPr>
           <w:rFonts w:hint="eastAsia"/>
@@ -12600,12 +12902,26 @@
         <w:rPr>
           <w:rFonts w:ascii="Noto Sans" w:eastAsia="微软雅黑" w:hAnsi="Noto Sans" w:cs="Noto Sans"/>
         </w:rPr>
-        <w:t xml:space="preserve"> Vivado </w:t>
-      </w:r>
+        <w:t xml:space="preserve"> </w:t>
+      </w:r>
+      <w:proofErr w:type="spellStart"/>
       <w:r>
         <w:rPr>
           <w:rFonts w:ascii="Noto Sans" w:eastAsia="微软雅黑" w:hAnsi="Noto Sans" w:cs="Noto Sans"/>
         </w:rPr>
+        <w:t>Vivado</w:t>
+      </w:r>
+      <w:proofErr w:type="spellEnd"/>
+      <w:r>
+        <w:rPr>
+          <w:rFonts w:ascii="Noto Sans" w:eastAsia="微软雅黑" w:hAnsi="Noto Sans" w:cs="Noto Sans"/>
+        </w:rPr>
+        <w:t xml:space="preserve"> </w:t>
+      </w:r>
+      <w:r>
+        <w:rPr>
+          <w:rFonts w:ascii="Noto Sans" w:eastAsia="微软雅黑" w:hAnsi="Noto Sans" w:cs="Noto Sans"/>
+        </w:rPr>
         <w:t>到</w:t>
       </w:r>
       <w:r>
@@ -12623,8 +12939,13 @@
       <w:r>
         <w:t>这一节只建立最小闭环：</w:t>
       </w:r>
-      <w:r>
-        <w:t xml:space="preserve">Vivado </w:t>
+      <w:proofErr w:type="spellStart"/>
+      <w:r>
+        <w:t>Vivado</w:t>
+      </w:r>
+      <w:proofErr w:type="spellEnd"/>
+      <w:r>
+        <w:t xml:space="preserve"> </w:t>
       </w:r>
       <w:r>
         <w:t>能生成比特流，</w:t>
@@ -12674,7 +12995,14 @@
         <w:rPr>
           <w:rFonts w:hint="eastAsia"/>
         </w:rPr>
-        <w:t>在进行搭建过程时若时间充裕</w:t>
+        <w:t>在进行搭建过程时若时间</w:t>
+      </w:r>
+      <w:proofErr w:type="gramStart"/>
+      <w:r>
+        <w:rPr>
+          <w:rFonts w:hint="eastAsia"/>
+        </w:rPr>
+        <w:t>充裕</w:t>
       </w:r>
       <w:r>
         <w:rPr>
@@ -12682,6 +13010,7 @@
         </w:rPr>
         <w:t>,</w:t>
       </w:r>
+      <w:proofErr w:type="gramEnd"/>
       <w:r>
         <w:rPr>
           <w:rFonts w:hint="eastAsia"/>
@@ -12704,12 +13033,14 @@
         </w:rPr>
         <w:t>先在</w:t>
       </w:r>
+      <w:proofErr w:type="spellStart"/>
       <w:r>
         <w:rPr>
           <w:rFonts w:hint="eastAsia"/>
         </w:rPr>
         <w:t>vivado</w:t>
       </w:r>
+      <w:proofErr w:type="spellEnd"/>
       <w:r>
         <w:rPr>
           <w:rFonts w:hint="eastAsia"/>
@@ -12773,12 +13104,14 @@
         </w:rPr>
         <w:t>（这里</w:t>
       </w:r>
+      <w:proofErr w:type="spellStart"/>
       <w:r>
         <w:rPr>
           <w:rFonts w:hint="eastAsia"/>
         </w:rPr>
         <w:t>vivado</w:t>
       </w:r>
+      <w:proofErr w:type="spellEnd"/>
       <w:r>
         <w:rPr>
           <w:rFonts w:hint="eastAsia"/>
@@ -12877,7 +13210,15 @@
         <w:t>中</w:t>
       </w:r>
       <w:r>
-        <w:t xml:space="preserve"> led_red </w:t>
+        <w:t xml:space="preserve"> </w:t>
+      </w:r>
+      <w:proofErr w:type="spellStart"/>
+      <w:r>
+        <w:t>led_red</w:t>
+      </w:r>
+      <w:proofErr w:type="spellEnd"/>
+      <w:r>
+        <w:t xml:space="preserve"> </w:t>
       </w:r>
       <w:r>
         <w:t>的引脚约束。</w:t>
@@ -13249,8 +13590,13 @@
         <w:t>先接到</w:t>
       </w:r>
       <w:r>
-        <w:t xml:space="preserve"> axi_interconnect</w:t>
-      </w:r>
+        <w:t xml:space="preserve"> </w:t>
+      </w:r>
+      <w:proofErr w:type="spellStart"/>
+      <w:r>
+        <w:t>axi_interconnect</w:t>
+      </w:r>
+      <w:proofErr w:type="spellEnd"/>
       <w:r>
         <w:t>，再接到</w:t>
       </w:r>
@@ -13288,13 +13634,26 @@
         <w:t>位输出</w:t>
       </w:r>
       <w:r>
-        <w:t xml:space="preserve"> gpio_io_o</w:t>
-      </w:r>
+        <w:t xml:space="preserve"> </w:t>
+      </w:r>
+      <w:proofErr w:type="spellStart"/>
+      <w:r>
+        <w:t>gpio_io_o</w:t>
+      </w:r>
+      <w:proofErr w:type="spellEnd"/>
       <w:r>
         <w:t>，再驱动</w:t>
       </w:r>
       <w:r>
-        <w:t xml:space="preserve"> led_ctl </w:t>
+        <w:t xml:space="preserve"> </w:t>
+      </w:r>
+      <w:proofErr w:type="spellStart"/>
+      <w:r>
+        <w:t>led_ctl</w:t>
+      </w:r>
+      <w:proofErr w:type="spellEnd"/>
+      <w:r>
+        <w:t xml:space="preserve"> </w:t>
       </w:r>
       <w:r>
         <w:t>的</w:t>
@@ -13622,7 +13981,15 @@
         <w:t>表</w:t>
       </w:r>
       <w:r>
-        <w:t xml:space="preserve"> 3-2  AXI </w:t>
+        <w:t xml:space="preserve"> 3-</w:t>
+      </w:r>
+      <w:proofErr w:type="gramStart"/>
+      <w:r>
+        <w:t>2  AXI</w:t>
+      </w:r>
+      <w:proofErr w:type="gramEnd"/>
+      <w:r>
+        <w:t xml:space="preserve"> </w:t>
       </w:r>
       <w:r>
         <w:t>五个独立事务通道</w:t>
@@ -13649,7 +14016,6 @@
           <w:right w:w="100" w:type="dxa"/>
         </w:tblCellMar>
         <w:tblLook w:val="0020" w:firstRow="1" w:lastRow="0" w:firstColumn="0" w:lastColumn="0" w:noHBand="0" w:noVBand="0"/>
-        <w:tblCaption w:val="AXI协议五个独立事务通道说明"/>
       </w:tblPr>
       <w:tblGrid>
         <w:gridCol w:w="1944"/>
@@ -14356,24 +14722,28 @@
         </w:rPr>
         <w:t>可以处理突发事件，用</w:t>
       </w:r>
+      <w:proofErr w:type="spellStart"/>
       <w:r>
         <w:rPr>
           <w:rFonts w:hint="eastAsia"/>
         </w:rPr>
         <w:t>AxSIZE</w:t>
       </w:r>
+      <w:proofErr w:type="spellEnd"/>
       <w:r>
         <w:rPr>
           <w:rFonts w:hint="eastAsia"/>
         </w:rPr>
         <w:t>表示突发大小，</w:t>
       </w:r>
+      <w:proofErr w:type="spellStart"/>
       <w:r>
         <w:rPr>
           <w:rFonts w:hint="eastAsia"/>
         </w:rPr>
         <w:t>AxBURST</w:t>
       </w:r>
+      <w:proofErr w:type="spellEnd"/>
       <w:r>
         <w:rPr>
           <w:rFonts w:hint="eastAsia"/>
@@ -14853,12 +15223,14 @@
         </w:rPr>
         <w:t>这就意味着输入的命令需要名字，文件</w:t>
       </w:r>
+      <w:proofErr w:type="spellStart"/>
       <w:r>
         <w:rPr>
           <w:rFonts w:hint="eastAsia"/>
         </w:rPr>
         <w:t>shell.h</w:t>
       </w:r>
+      <w:proofErr w:type="spellEnd"/>
       <w:r>
         <w:rPr>
           <w:rFonts w:hint="eastAsia"/>
@@ -14877,7 +15249,61 @@
           <w:rFonts w:cs="Consolas"/>
           <w:sz w:val="18"/>
         </w:rPr>
-        <w:t>#define SHELL_EXPORT_CMD(_attr, _name, _func, _desc)</w:t>
+        <w:t>#define SHELL_EXPORT_</w:t>
+      </w:r>
+      <w:proofErr w:type="gramStart"/>
+      <w:r>
+        <w:rPr>
+          <w:rStyle w:val="VerbatimChar"/>
+          <w:rFonts w:cs="Consolas"/>
+          <w:sz w:val="18"/>
+        </w:rPr>
+        <w:t>CMD(</w:t>
+      </w:r>
+      <w:proofErr w:type="gramEnd"/>
+      <w:r>
+        <w:rPr>
+          <w:rStyle w:val="VerbatimChar"/>
+          <w:rFonts w:cs="Consolas"/>
+          <w:sz w:val="18"/>
+        </w:rPr>
+        <w:t>_</w:t>
+      </w:r>
+      <w:proofErr w:type="spellStart"/>
+      <w:r>
+        <w:rPr>
+          <w:rStyle w:val="VerbatimChar"/>
+          <w:rFonts w:cs="Consolas"/>
+          <w:sz w:val="18"/>
+        </w:rPr>
+        <w:t>attr</w:t>
+      </w:r>
+      <w:proofErr w:type="spellEnd"/>
+      <w:r>
+        <w:rPr>
+          <w:rStyle w:val="VerbatimChar"/>
+          <w:rFonts w:cs="Consolas"/>
+          <w:sz w:val="18"/>
+        </w:rPr>
+        <w:t>, _name, _</w:t>
+      </w:r>
+      <w:proofErr w:type="spellStart"/>
+      <w:r>
+        <w:rPr>
+          <w:rStyle w:val="VerbatimChar"/>
+          <w:rFonts w:cs="Consolas"/>
+          <w:sz w:val="18"/>
+        </w:rPr>
+        <w:t>func</w:t>
+      </w:r>
+      <w:proofErr w:type="spellEnd"/>
+      <w:r>
+        <w:rPr>
+          <w:rStyle w:val="VerbatimChar"/>
+          <w:rFonts w:cs="Consolas"/>
+          <w:sz w:val="18"/>
+        </w:rPr>
+        <w:t>, _desc)</w:t>
       </w:r>
     </w:p>
     <w:p>
@@ -14891,12 +15317,14 @@
         <w:lastRenderedPageBreak/>
         <w:t>这个宏定义在给自己建立的命令进行设置并纳入</w:t>
       </w:r>
+      <w:proofErr w:type="spellStart"/>
       <w:r>
         <w:rPr>
           <w:rFonts w:hint="eastAsia"/>
         </w:rPr>
         <w:t>shellCommandList</w:t>
       </w:r>
+      <w:proofErr w:type="spellEnd"/>
       <w:r>
         <w:rPr>
           <w:rFonts w:hint="eastAsia"/>
@@ -14912,7 +15340,15 @@
         <w:t>表</w:t>
       </w:r>
       <w:r>
-        <w:t xml:space="preserve"> 3-3  shell </w:t>
+        <w:t xml:space="preserve"> 3-</w:t>
+      </w:r>
+      <w:proofErr w:type="gramStart"/>
+      <w:r>
+        <w:t>3  shell</w:t>
+      </w:r>
+      <w:proofErr w:type="gramEnd"/>
+      <w:r>
+        <w:t xml:space="preserve"> </w:t>
       </w:r>
       <w:r>
         <w:t>命令导出宏参数</w:t>
@@ -14939,7 +15375,6 @@
           <w:right w:w="100" w:type="dxa"/>
         </w:tblCellMar>
         <w:tblLook w:val="0020" w:firstRow="1" w:lastRow="0" w:firstColumn="0" w:lastColumn="0" w:noHBand="0" w:noVBand="0"/>
-        <w:tblCaption w:val="参数解释"/>
       </w:tblPr>
       <w:tblGrid>
         <w:gridCol w:w="1224"/>
@@ -15136,8 +15571,19 @@
                 <w:color w:val="000000"/>
                 <w:sz w:val="17"/>
               </w:rPr>
-              <w:t>_attr</w:t>
-            </w:r>
+              <w:t>_</w:t>
+            </w:r>
+            <w:proofErr w:type="spellStart"/>
+            <w:r>
+              <w:rPr>
+                <w:rStyle w:val="VerbatimChar"/>
+                <w:rFonts w:ascii="Noto Sans" w:hAnsi="Noto Sans"/>
+                <w:color w:val="000000"/>
+                <w:sz w:val="17"/>
+              </w:rPr>
+              <w:t>attr</w:t>
+            </w:r>
+            <w:proofErr w:type="spellEnd"/>
           </w:p>
         </w:tc>
         <w:tc>
@@ -15364,8 +15810,19 @@
                 <w:color w:val="000000"/>
                 <w:sz w:val="17"/>
               </w:rPr>
-              <w:t>_func</w:t>
-            </w:r>
+              <w:t>_</w:t>
+            </w:r>
+            <w:proofErr w:type="spellStart"/>
+            <w:r>
+              <w:rPr>
+                <w:rStyle w:val="VerbatimChar"/>
+                <w:rFonts w:ascii="Noto Sans" w:hAnsi="Noto Sans"/>
+                <w:color w:val="000000"/>
+                <w:sz w:val="17"/>
+              </w:rPr>
+              <w:t>func</w:t>
+            </w:r>
+            <w:proofErr w:type="spellEnd"/>
           </w:p>
         </w:tc>
         <w:tc>
@@ -15434,6 +15891,7 @@
               <w:pStyle w:val="Compact"/>
               <w:spacing w:before="0" w:after="0" w:line="252" w:lineRule="auto"/>
             </w:pPr>
+            <w:proofErr w:type="spellStart"/>
             <w:r>
               <w:rPr>
                 <w:rStyle w:val="VerbatimChar"/>
@@ -15443,6 +15901,7 @@
               </w:rPr>
               <w:t>led_cmd</w:t>
             </w:r>
+            <w:proofErr w:type="spellEnd"/>
           </w:p>
         </w:tc>
       </w:tr>
@@ -15616,17 +16075,26 @@
         </w:rPr>
         <w:t>在</w:t>
       </w:r>
+      <w:proofErr w:type="spellStart"/>
       <w:r>
         <w:rPr>
           <w:rFonts w:hint="eastAsia"/>
         </w:rPr>
         <w:t>shell.h</w:t>
       </w:r>
-      <w:r>
-        <w:rPr>
-          <w:rFonts w:hint="eastAsia"/>
-        </w:rPr>
-        <w:t>文件里提到了读写函数设置规则</w:t>
+      <w:proofErr w:type="spellEnd"/>
+      <w:r>
+        <w:rPr>
+          <w:rFonts w:hint="eastAsia"/>
+        </w:rPr>
+        <w:t>文件里提到了读写函数设置</w:t>
+      </w:r>
+      <w:proofErr w:type="gramStart"/>
+      <w:r>
+        <w:rPr>
+          <w:rFonts w:hint="eastAsia"/>
+        </w:rPr>
+        <w:t>规则</w:t>
       </w:r>
       <w:r>
         <w:rPr>
@@ -15634,6 +16102,7 @@
         </w:rPr>
         <w:t>:</w:t>
       </w:r>
+      <w:proofErr w:type="gramEnd"/>
     </w:p>
     <w:p>
       <w:pPr>
@@ -15646,21 +16115,57 @@
           <w:rFonts w:cs="Consolas"/>
           <w:sz w:val="18"/>
         </w:rPr>
-        <w:t xml:space="preserve">    signed short (*read)(char *, unsigned short); </w:t>
-      </w:r>
-      <w:r>
-        <w:rPr>
-          <w:rFonts w:cs="Consolas"/>
-        </w:rPr>
-        <w:br/>
-      </w:r>
+        <w:t xml:space="preserve">    signed short (*</w:t>
+      </w:r>
+      <w:proofErr w:type="gramStart"/>
       <w:r>
         <w:rPr>
           <w:rStyle w:val="VerbatimChar"/>
           <w:rFonts w:cs="Consolas"/>
           <w:sz w:val="18"/>
         </w:rPr>
-        <w:t xml:space="preserve">    signed short (*write)(char *, unsigned short);</w:t>
+        <w:t>read)(</w:t>
+      </w:r>
+      <w:proofErr w:type="gramEnd"/>
+      <w:r>
+        <w:rPr>
+          <w:rStyle w:val="VerbatimChar"/>
+          <w:rFonts w:cs="Consolas"/>
+          <w:sz w:val="18"/>
+        </w:rPr>
+        <w:t xml:space="preserve">char *, unsigned short); </w:t>
+      </w:r>
+      <w:r>
+        <w:rPr>
+          <w:rFonts w:cs="Consolas"/>
+        </w:rPr>
+        <w:br/>
+      </w:r>
+      <w:r>
+        <w:rPr>
+          <w:rStyle w:val="VerbatimChar"/>
+          <w:rFonts w:cs="Consolas"/>
+          <w:sz w:val="18"/>
+        </w:rPr>
+        <w:t xml:space="preserve">    signed short (*</w:t>
+      </w:r>
+      <w:proofErr w:type="gramStart"/>
+      <w:r>
+        <w:rPr>
+          <w:rStyle w:val="VerbatimChar"/>
+          <w:rFonts w:cs="Consolas"/>
+          <w:sz w:val="18"/>
+        </w:rPr>
+        <w:t>write)(</w:t>
+      </w:r>
+      <w:proofErr w:type="gramEnd"/>
+      <w:r>
+        <w:rPr>
+          <w:rStyle w:val="VerbatimChar"/>
+          <w:rFonts w:cs="Consolas"/>
+          <w:sz w:val="18"/>
+        </w:rPr>
+        <w:t>char *, unsigned short);</w:t>
       </w:r>
     </w:p>
     <w:p>
@@ -15673,24 +16178,28 @@
         </w:rPr>
         <w:t>在此引入两个参量，即数据指针和字符长度，通过</w:t>
       </w:r>
+      <w:proofErr w:type="spellStart"/>
       <w:r>
         <w:rPr>
           <w:rFonts w:hint="eastAsia"/>
         </w:rPr>
         <w:t>xuartps.h</w:t>
       </w:r>
+      <w:proofErr w:type="spellEnd"/>
       <w:r>
         <w:rPr>
           <w:rFonts w:hint="eastAsia"/>
         </w:rPr>
         <w:t>文件中的函数去进行数据读取，这里需要设置读取地址，推荐使用结构体，这样可以在换平台是由运行</w:t>
       </w:r>
+      <w:proofErr w:type="spellStart"/>
       <w:r>
         <w:rPr>
           <w:rFonts w:hint="eastAsia"/>
         </w:rPr>
         <w:t>bsp</w:t>
       </w:r>
+      <w:proofErr w:type="spellEnd"/>
       <w:r>
         <w:rPr>
           <w:rFonts w:hint="eastAsia"/>
@@ -15909,7 +16418,15 @@
         <w:t>位宽配置；实际颗粒和容量应以板卡丝印、原理图和</w:t>
       </w:r>
       <w:r>
-        <w:t xml:space="preserve"> Vivado PS </w:t>
+        <w:t xml:space="preserve"> </w:t>
+      </w:r>
+      <w:proofErr w:type="spellStart"/>
+      <w:r>
+        <w:t>Vivado</w:t>
+      </w:r>
+      <w:proofErr w:type="spellEnd"/>
+      <w:r>
+        <w:t xml:space="preserve"> PS </w:t>
       </w:r>
       <w:r>
         <w:t>配置为准。</w:t>
@@ -16041,7 +16558,15 @@
         <w:t>启动、程序加载和栈空间；更换颗粒时必须同步修改</w:t>
       </w:r>
       <w:r>
-        <w:t xml:space="preserve"> Vivado </w:t>
+        <w:t xml:space="preserve"> </w:t>
+      </w:r>
+      <w:proofErr w:type="spellStart"/>
+      <w:r>
+        <w:t>Vivado</w:t>
+      </w:r>
+      <w:proofErr w:type="spellEnd"/>
+      <w:r>
+        <w:t xml:space="preserve"> </w:t>
       </w:r>
       <w:r>
         <w:t>中的</w:t>
@@ -16201,13 +16726,29 @@
         <w:t>检查</w:t>
       </w:r>
       <w:r>
-        <w:t xml:space="preserve"> lscript.ld </w:t>
+        <w:t xml:space="preserve"> </w:t>
+      </w:r>
+      <w:proofErr w:type="spellStart"/>
+      <w:r>
+        <w:t>lscript.ld</w:t>
+      </w:r>
+      <w:proofErr w:type="spellEnd"/>
+      <w:r>
+        <w:t xml:space="preserve"> </w:t>
       </w:r>
       <w:r>
         <w:t>是否保留</w:t>
       </w:r>
       <w:r>
-        <w:t xml:space="preserve"> shellCommand </w:t>
+        <w:t xml:space="preserve"> </w:t>
+      </w:r>
+      <w:proofErr w:type="spellStart"/>
+      <w:r>
+        <w:t>shellCommand</w:t>
+      </w:r>
+      <w:proofErr w:type="spellEnd"/>
+      <w:r>
+        <w:t xml:space="preserve"> </w:t>
       </w:r>
       <w:r>
         <w:t>段的起止符号。</w:t>
@@ -16457,12 +16998,14 @@
         </w:rPr>
         <w:t>部分：给</w:t>
       </w:r>
+      <w:proofErr w:type="spellStart"/>
       <w:r>
         <w:rPr>
           <w:rFonts w:hint="eastAsia"/>
         </w:rPr>
         <w:t>shellCommand</w:t>
       </w:r>
+      <w:proofErr w:type="spellEnd"/>
       <w:r>
         <w:rPr>
           <w:rFonts w:hint="eastAsia"/>
@@ -16473,8 +17016,16 @@
         <w:rPr>
           <w:rFonts w:hint="eastAsia"/>
         </w:rPr>
-        <w:t>.ld</w:t>
-      </w:r>
+        <w:t>.</w:t>
+      </w:r>
+      <w:proofErr w:type="spellStart"/>
+      <w:r>
+        <w:rPr>
+          <w:rFonts w:hint="eastAsia"/>
+        </w:rPr>
+        <w:t>ld</w:t>
+      </w:r>
+      <w:proofErr w:type="spellEnd"/>
       <w:r>
         <w:rPr>
           <w:rFonts w:hint="eastAsia"/>
@@ -16546,24 +17097,28 @@
         </w:rPr>
         <w:t>详细</w:t>
       </w:r>
+      <w:proofErr w:type="spellStart"/>
       <w:r>
         <w:rPr>
           <w:rFonts w:hint="eastAsia"/>
         </w:rPr>
         <w:t>verilog</w:t>
       </w:r>
+      <w:proofErr w:type="spellEnd"/>
       <w:r>
         <w:rPr>
           <w:rFonts w:hint="eastAsia"/>
         </w:rPr>
         <w:t>语法和</w:t>
       </w:r>
+      <w:proofErr w:type="spellStart"/>
       <w:r>
         <w:rPr>
           <w:rFonts w:hint="eastAsia"/>
         </w:rPr>
         <w:t>Vivado</w:t>
       </w:r>
+      <w:proofErr w:type="spellEnd"/>
       <w:r>
         <w:rPr>
           <w:rFonts w:hint="eastAsia"/>
@@ -16946,12 +17501,14 @@
         </w:rPr>
         <w:t>登录时在</w:t>
       </w:r>
+      <w:proofErr w:type="spellStart"/>
       <w:r>
         <w:rPr>
           <w:rFonts w:hint="eastAsia"/>
         </w:rPr>
         <w:t>VScode</w:t>
       </w:r>
+      <w:proofErr w:type="spellEnd"/>
       <w:r>
         <w:rPr>
           <w:rFonts w:hint="eastAsia"/>
@@ -17281,7 +17838,40 @@
           <w:color w:val="4B5563"/>
           <w:sz w:val="18"/>
         </w:rPr>
-        <w:t xml:space="preserve">  ·  _xiaohu_  |  11:11:28</w:t>
+        <w:t xml:space="preserve">  ·  _</w:t>
+      </w:r>
+      <w:proofErr w:type="spellStart"/>
+      <w:r>
+        <w:rPr>
+          <w:color w:val="4B5563"/>
+          <w:sz w:val="18"/>
+        </w:rPr>
+        <w:t>xiaohu</w:t>
+      </w:r>
+      <w:proofErr w:type="spellEnd"/>
+      <w:proofErr w:type="gramStart"/>
+      <w:r>
+        <w:rPr>
+          <w:color w:val="4B5563"/>
+          <w:sz w:val="18"/>
+        </w:rPr>
+        <w:t>_  |</w:t>
+      </w:r>
+      <w:proofErr w:type="gramEnd"/>
+      <w:r>
+        <w:rPr>
+          <w:color w:val="4B5563"/>
+          <w:sz w:val="18"/>
+        </w:rPr>
+        <w:t xml:space="preserve">  </w:t>
+      </w:r>
+      <w:proofErr w:type="gramStart"/>
+      <w:r>
+        <w:rPr>
+          <w:color w:val="4B5563"/>
+          <w:sz w:val="18"/>
+        </w:rPr>
+        <w:t>11:11:28</w:t>
       </w:r>
       <w:r>
         <w:rPr>
@@ -17289,7 +17879,16 @@
           <w:color w:val="4B5563"/>
           <w:sz w:val="18"/>
         </w:rPr>
-        <w:t xml:space="preserve">  |  </w:t>
+        <w:t xml:space="preserve">  |</w:t>
+      </w:r>
+      <w:proofErr w:type="gramEnd"/>
+      <w:r>
+        <w:rPr>
+          <w:i/>
+          <w:color w:val="4B5563"/>
+          <w:sz w:val="18"/>
+        </w:rPr>
+        <w:t xml:space="preserve">  </w:t>
       </w:r>
       <w:r>
         <w:rPr>
@@ -17352,6 +17951,7 @@
         </w:rPr>
         <w:t xml:space="preserve">  ·  </w:t>
       </w:r>
+      <w:proofErr w:type="gramStart"/>
       <w:r>
         <w:rPr>
           <w:color w:val="4B5563"/>
@@ -17364,7 +17964,23 @@
           <w:color w:val="4B5563"/>
           <w:sz w:val="18"/>
         </w:rPr>
-        <w:t xml:space="preserve">  |  7:59:36</w:t>
+        <w:t xml:space="preserve">  |</w:t>
+      </w:r>
+      <w:proofErr w:type="gramEnd"/>
+      <w:r>
+        <w:rPr>
+          <w:color w:val="4B5563"/>
+          <w:sz w:val="18"/>
+        </w:rPr>
+        <w:t xml:space="preserve">  </w:t>
+      </w:r>
+      <w:proofErr w:type="gramStart"/>
+      <w:r>
+        <w:rPr>
+          <w:color w:val="4B5563"/>
+          <w:sz w:val="18"/>
+        </w:rPr>
+        <w:t>7:59:36</w:t>
       </w:r>
       <w:r>
         <w:rPr>
@@ -17372,7 +17988,16 @@
           <w:color w:val="4B5563"/>
           <w:sz w:val="18"/>
         </w:rPr>
-        <w:t xml:space="preserve">  |  </w:t>
+        <w:t xml:space="preserve">  |</w:t>
+      </w:r>
+      <w:proofErr w:type="gramEnd"/>
+      <w:r>
+        <w:rPr>
+          <w:i/>
+          <w:color w:val="4B5563"/>
+          <w:sz w:val="18"/>
+        </w:rPr>
+        <w:t xml:space="preserve">  </w:t>
       </w:r>
       <w:r>
         <w:rPr>
@@ -17467,6 +18092,7 @@
         </w:rPr>
         <w:t xml:space="preserve">  ·  </w:t>
       </w:r>
+      <w:proofErr w:type="gramStart"/>
       <w:r>
         <w:rPr>
           <w:color w:val="4B5563"/>
@@ -17479,7 +18105,23 @@
           <w:color w:val="4B5563"/>
           <w:sz w:val="18"/>
         </w:rPr>
-        <w:t xml:space="preserve">  |  14:37</w:t>
+        <w:t xml:space="preserve">  |</w:t>
+      </w:r>
+      <w:proofErr w:type="gramEnd"/>
+      <w:r>
+        <w:rPr>
+          <w:color w:val="4B5563"/>
+          <w:sz w:val="18"/>
+        </w:rPr>
+        <w:t xml:space="preserve">  </w:t>
+      </w:r>
+      <w:proofErr w:type="gramStart"/>
+      <w:r>
+        <w:rPr>
+          <w:color w:val="4B5563"/>
+          <w:sz w:val="18"/>
+        </w:rPr>
+        <w:t>14:37</w:t>
       </w:r>
       <w:r>
         <w:rPr>
@@ -17487,7 +18129,16 @@
           <w:color w:val="4B5563"/>
           <w:sz w:val="18"/>
         </w:rPr>
-        <w:t xml:space="preserve">  |  Windows </w:t>
+        <w:t xml:space="preserve">  |</w:t>
+      </w:r>
+      <w:proofErr w:type="gramEnd"/>
+      <w:r>
+        <w:rPr>
+          <w:i/>
+          <w:color w:val="4B5563"/>
+          <w:sz w:val="18"/>
+        </w:rPr>
+        <w:t xml:space="preserve">  Windows </w:t>
       </w:r>
       <w:r>
         <w:rPr>
@@ -17542,6 +18193,7 @@
         </w:rPr>
         <w:t xml:space="preserve">  ·  </w:t>
       </w:r>
+      <w:proofErr w:type="gramStart"/>
       <w:r>
         <w:rPr>
           <w:color w:val="4B5563"/>
@@ -17554,7 +18206,23 @@
           <w:color w:val="4B5563"/>
           <w:sz w:val="18"/>
         </w:rPr>
-        <w:t xml:space="preserve">  |  24:33:44</w:t>
+        <w:t xml:space="preserve">  |</w:t>
+      </w:r>
+      <w:proofErr w:type="gramEnd"/>
+      <w:r>
+        <w:rPr>
+          <w:color w:val="4B5563"/>
+          <w:sz w:val="18"/>
+        </w:rPr>
+        <w:t xml:space="preserve">  </w:t>
+      </w:r>
+      <w:proofErr w:type="gramStart"/>
+      <w:r>
+        <w:rPr>
+          <w:color w:val="4B5563"/>
+          <w:sz w:val="18"/>
+        </w:rPr>
+        <w:t>24:33:44</w:t>
       </w:r>
       <w:r>
         <w:rPr>
@@ -17562,7 +18230,16 @@
           <w:color w:val="4B5563"/>
           <w:sz w:val="18"/>
         </w:rPr>
-        <w:t xml:space="preserve">  |  </w:t>
+        <w:t xml:space="preserve">  |</w:t>
+      </w:r>
+      <w:proofErr w:type="gramEnd"/>
+      <w:r>
+        <w:rPr>
+          <w:i/>
+          <w:color w:val="4B5563"/>
+          <w:sz w:val="18"/>
+        </w:rPr>
+        <w:t xml:space="preserve">  </w:t>
       </w:r>
       <w:r>
         <w:rPr>
@@ -17632,12 +18309,29 @@
         </w:rPr>
         <w:t>嵌入式</w:t>
       </w:r>
-      <w:r>
-        <w:rPr>
-          <w:color w:val="4B5563"/>
-          <w:sz w:val="18"/>
-        </w:rPr>
-        <w:t>-  |  12:02:26</w:t>
+      <w:proofErr w:type="gramStart"/>
+      <w:r>
+        <w:rPr>
+          <w:color w:val="4B5563"/>
+          <w:sz w:val="18"/>
+        </w:rPr>
+        <w:t>-  |</w:t>
+      </w:r>
+      <w:proofErr w:type="gramEnd"/>
+      <w:r>
+        <w:rPr>
+          <w:color w:val="4B5563"/>
+          <w:sz w:val="18"/>
+        </w:rPr>
+        <w:t xml:space="preserve">  </w:t>
+      </w:r>
+      <w:proofErr w:type="gramStart"/>
+      <w:r>
+        <w:rPr>
+          <w:color w:val="4B5563"/>
+          <w:sz w:val="18"/>
+        </w:rPr>
+        <w:t>12:02:26</w:t>
       </w:r>
       <w:r>
         <w:rPr>
@@ -17645,7 +18339,16 @@
           <w:color w:val="4B5563"/>
           <w:sz w:val="18"/>
         </w:rPr>
-        <w:t xml:space="preserve">  |  RTOS </w:t>
+        <w:t xml:space="preserve">  |</w:t>
+      </w:r>
+      <w:proofErr w:type="gramEnd"/>
+      <w:r>
+        <w:rPr>
+          <w:i/>
+          <w:color w:val="4B5563"/>
+          <w:sz w:val="18"/>
+        </w:rPr>
+        <w:t xml:space="preserve">  RTOS </w:t>
       </w:r>
       <w:r>
         <w:rPr>
@@ -17752,12 +18455,29 @@
         </w:rPr>
         <w:t>电子</w:t>
       </w:r>
-      <w:r>
-        <w:rPr>
-          <w:color w:val="4B5563"/>
-          <w:sz w:val="18"/>
-        </w:rPr>
-        <w:t>online  |  21:07:59</w:t>
+      <w:proofErr w:type="gramStart"/>
+      <w:r>
+        <w:rPr>
+          <w:color w:val="4B5563"/>
+          <w:sz w:val="18"/>
+        </w:rPr>
+        <w:t>online  |</w:t>
+      </w:r>
+      <w:proofErr w:type="gramEnd"/>
+      <w:r>
+        <w:rPr>
+          <w:color w:val="4B5563"/>
+          <w:sz w:val="18"/>
+        </w:rPr>
+        <w:t xml:space="preserve">  </w:t>
+      </w:r>
+      <w:proofErr w:type="gramStart"/>
+      <w:r>
+        <w:rPr>
+          <w:color w:val="4B5563"/>
+          <w:sz w:val="18"/>
+        </w:rPr>
+        <w:t>21:07:59</w:t>
       </w:r>
       <w:r>
         <w:rPr>
@@ -17765,7 +18485,16 @@
           <w:color w:val="4B5563"/>
           <w:sz w:val="18"/>
         </w:rPr>
-        <w:t xml:space="preserve">  |  </w:t>
+        <w:t xml:space="preserve">  |</w:t>
+      </w:r>
+      <w:proofErr w:type="gramEnd"/>
+      <w:r>
+        <w:rPr>
+          <w:i/>
+          <w:color w:val="4B5563"/>
+          <w:sz w:val="18"/>
+        </w:rPr>
+        <w:t xml:space="preserve">  </w:t>
       </w:r>
       <w:r>
         <w:rPr>
@@ -17844,6 +18573,7 @@
         </w:rPr>
         <w:t xml:space="preserve">  ·  </w:t>
       </w:r>
+      <w:proofErr w:type="gramStart"/>
       <w:r>
         <w:rPr>
           <w:color w:val="4B5563"/>
@@ -17856,7 +18586,23 @@
           <w:color w:val="4B5563"/>
           <w:sz w:val="18"/>
         </w:rPr>
-        <w:t xml:space="preserve">  |  11:11:29</w:t>
+        <w:t xml:space="preserve">  |</w:t>
+      </w:r>
+      <w:proofErr w:type="gramEnd"/>
+      <w:r>
+        <w:rPr>
+          <w:color w:val="4B5563"/>
+          <w:sz w:val="18"/>
+        </w:rPr>
+        <w:t xml:space="preserve">  </w:t>
+      </w:r>
+      <w:proofErr w:type="gramStart"/>
+      <w:r>
+        <w:rPr>
+          <w:color w:val="4B5563"/>
+          <w:sz w:val="18"/>
+        </w:rPr>
+        <w:t>11:11:29</w:t>
       </w:r>
       <w:r>
         <w:rPr>
@@ -17864,7 +18610,16 @@
           <w:color w:val="4B5563"/>
           <w:sz w:val="18"/>
         </w:rPr>
-        <w:t xml:space="preserve">  |  STM32 </w:t>
+        <w:t xml:space="preserve">  |</w:t>
+      </w:r>
+      <w:proofErr w:type="gramEnd"/>
+      <w:r>
+        <w:rPr>
+          <w:i/>
+          <w:color w:val="4B5563"/>
+          <w:sz w:val="18"/>
+        </w:rPr>
+        <w:t xml:space="preserve">  STM32 </w:t>
       </w:r>
       <w:r>
         <w:rPr>
@@ -17919,6 +18674,7 @@
         </w:rPr>
         <w:t xml:space="preserve">  ·  </w:t>
       </w:r>
+      <w:proofErr w:type="gramStart"/>
       <w:r>
         <w:rPr>
           <w:color w:val="4B5563"/>
@@ -17931,7 +18687,23 @@
           <w:color w:val="4B5563"/>
           <w:sz w:val="18"/>
         </w:rPr>
-        <w:t xml:space="preserve">  |  2:01:46</w:t>
+        <w:t xml:space="preserve">  |</w:t>
+      </w:r>
+      <w:proofErr w:type="gramEnd"/>
+      <w:r>
+        <w:rPr>
+          <w:color w:val="4B5563"/>
+          <w:sz w:val="18"/>
+        </w:rPr>
+        <w:t xml:space="preserve">  </w:t>
+      </w:r>
+      <w:proofErr w:type="gramStart"/>
+      <w:r>
+        <w:rPr>
+          <w:color w:val="4B5563"/>
+          <w:sz w:val="18"/>
+        </w:rPr>
+        <w:t>2:01:46</w:t>
       </w:r>
       <w:r>
         <w:rPr>
@@ -17939,7 +18711,16 @@
           <w:color w:val="4B5563"/>
           <w:sz w:val="18"/>
         </w:rPr>
-        <w:t xml:space="preserve">  |  </w:t>
+        <w:t xml:space="preserve">  |</w:t>
+      </w:r>
+      <w:proofErr w:type="gramEnd"/>
+      <w:r>
+        <w:rPr>
+          <w:i/>
+          <w:color w:val="4B5563"/>
+          <w:sz w:val="18"/>
+        </w:rPr>
+        <w:t xml:space="preserve">  </w:t>
       </w:r>
       <w:r>
         <w:rPr>
@@ -17994,6 +18775,7 @@
         </w:rPr>
         <w:t xml:space="preserve">  ·  </w:t>
       </w:r>
+      <w:proofErr w:type="gramStart"/>
       <w:r>
         <w:rPr>
           <w:color w:val="4B5563"/>
@@ -18006,7 +18788,23 @@
           <w:color w:val="4B5563"/>
           <w:sz w:val="18"/>
         </w:rPr>
-        <w:t xml:space="preserve">  |  12:19:57</w:t>
+        <w:t xml:space="preserve">  |</w:t>
+      </w:r>
+      <w:proofErr w:type="gramEnd"/>
+      <w:r>
+        <w:rPr>
+          <w:color w:val="4B5563"/>
+          <w:sz w:val="18"/>
+        </w:rPr>
+        <w:t xml:space="preserve">  </w:t>
+      </w:r>
+      <w:proofErr w:type="gramStart"/>
+      <w:r>
+        <w:rPr>
+          <w:color w:val="4B5563"/>
+          <w:sz w:val="18"/>
+        </w:rPr>
+        <w:t>12:19:57</w:t>
       </w:r>
       <w:r>
         <w:rPr>
@@ -18014,7 +18812,16 @@
           <w:color w:val="4B5563"/>
           <w:sz w:val="18"/>
         </w:rPr>
-        <w:t xml:space="preserve">  |  </w:t>
+        <w:t xml:space="preserve">  |</w:t>
+      </w:r>
+      <w:proofErr w:type="gramEnd"/>
+      <w:r>
+        <w:rPr>
+          <w:i/>
+          <w:color w:val="4B5563"/>
+          <w:sz w:val="18"/>
+        </w:rPr>
+        <w:t xml:space="preserve">  </w:t>
       </w:r>
       <w:r>
         <w:rPr>
@@ -18101,6 +18908,7 @@
         </w:rPr>
         <w:t xml:space="preserve">  ·  </w:t>
       </w:r>
+      <w:proofErr w:type="gramStart"/>
       <w:r>
         <w:rPr>
           <w:color w:val="4B5563"/>
@@ -18113,7 +18921,23 @@
           <w:color w:val="4B5563"/>
           <w:sz w:val="18"/>
         </w:rPr>
-        <w:t xml:space="preserve">  |  19:44:16</w:t>
+        <w:t xml:space="preserve">  |</w:t>
+      </w:r>
+      <w:proofErr w:type="gramEnd"/>
+      <w:r>
+        <w:rPr>
+          <w:color w:val="4B5563"/>
+          <w:sz w:val="18"/>
+        </w:rPr>
+        <w:t xml:space="preserve">  19:44:</w:t>
+      </w:r>
+      <w:proofErr w:type="gramStart"/>
+      <w:r>
+        <w:rPr>
+          <w:color w:val="4B5563"/>
+          <w:sz w:val="18"/>
+        </w:rPr>
+        <w:t>16</w:t>
       </w:r>
       <w:r>
         <w:rPr>
@@ -18121,7 +18945,16 @@
           <w:color w:val="4B5563"/>
           <w:sz w:val="18"/>
         </w:rPr>
-        <w:t xml:space="preserve">  |  </w:t>
+        <w:t xml:space="preserve">  |</w:t>
+      </w:r>
+      <w:proofErr w:type="gramEnd"/>
+      <w:r>
+        <w:rPr>
+          <w:i/>
+          <w:color w:val="4B5563"/>
+          <w:sz w:val="18"/>
+        </w:rPr>
+        <w:t xml:space="preserve">  </w:t>
       </w:r>
       <w:r>
         <w:rPr>
@@ -18254,7 +19087,31 @@
           <w:color w:val="4B5563"/>
           <w:sz w:val="18"/>
         </w:rPr>
-        <w:t>-H2O  |  44:29</w:t>
+        <w:t>-</w:t>
+      </w:r>
+      <w:proofErr w:type="gramStart"/>
+      <w:r>
+        <w:rPr>
+          <w:color w:val="4B5563"/>
+          <w:sz w:val="18"/>
+        </w:rPr>
+        <w:t>H2O  |</w:t>
+      </w:r>
+      <w:proofErr w:type="gramEnd"/>
+      <w:r>
+        <w:rPr>
+          <w:color w:val="4B5563"/>
+          <w:sz w:val="18"/>
+        </w:rPr>
+        <w:t xml:space="preserve">  </w:t>
+      </w:r>
+      <w:proofErr w:type="gramStart"/>
+      <w:r>
+        <w:rPr>
+          <w:color w:val="4B5563"/>
+          <w:sz w:val="18"/>
+        </w:rPr>
+        <w:t>44:29</w:t>
       </w:r>
       <w:r>
         <w:rPr>
@@ -18262,7 +19119,16 @@
           <w:color w:val="4B5563"/>
           <w:sz w:val="18"/>
         </w:rPr>
-        <w:t xml:space="preserve">  |  </w:t>
+        <w:t xml:space="preserve">  |</w:t>
+      </w:r>
+      <w:proofErr w:type="gramEnd"/>
+      <w:r>
+        <w:rPr>
+          <w:i/>
+          <w:color w:val="4B5563"/>
+          <w:sz w:val="18"/>
+        </w:rPr>
+        <w:t xml:space="preserve">  </w:t>
       </w:r>
       <w:r>
         <w:rPr>
@@ -18317,6 +19183,7 @@
         </w:rPr>
         <w:t xml:space="preserve">  ·  CPP</w:t>
       </w:r>
+      <w:proofErr w:type="gramStart"/>
       <w:r>
         <w:rPr>
           <w:color w:val="4B5563"/>
@@ -18329,7 +19196,23 @@
           <w:color w:val="4B5563"/>
           <w:sz w:val="18"/>
         </w:rPr>
-        <w:t xml:space="preserve">  |  43:31:10</w:t>
+        <w:t xml:space="preserve">  |</w:t>
+      </w:r>
+      <w:proofErr w:type="gramEnd"/>
+      <w:r>
+        <w:rPr>
+          <w:color w:val="4B5563"/>
+          <w:sz w:val="18"/>
+        </w:rPr>
+        <w:t xml:space="preserve">  </w:t>
+      </w:r>
+      <w:proofErr w:type="gramStart"/>
+      <w:r>
+        <w:rPr>
+          <w:color w:val="4B5563"/>
+          <w:sz w:val="18"/>
+        </w:rPr>
+        <w:t>43:31:10</w:t>
       </w:r>
       <w:r>
         <w:rPr>
@@ -18337,23 +19220,42 @@
           <w:color w:val="4B5563"/>
           <w:sz w:val="18"/>
         </w:rPr>
-        <w:t xml:space="preserve">  |  socket</w:t>
-      </w:r>
+        <w:t xml:space="preserve">  |</w:t>
+      </w:r>
+      <w:proofErr w:type="gramEnd"/>
       <w:r>
         <w:rPr>
           <w:i/>
           <w:color w:val="4B5563"/>
           <w:sz w:val="18"/>
         </w:rPr>
+        <w:t xml:space="preserve">  socket</w:t>
+      </w:r>
+      <w:r>
+        <w:rPr>
+          <w:i/>
+          <w:color w:val="4B5563"/>
+          <w:sz w:val="18"/>
+        </w:rPr>
         <w:t>、</w:t>
       </w:r>
+      <w:proofErr w:type="spellStart"/>
       <w:r>
         <w:rPr>
           <w:i/>
           <w:color w:val="4B5563"/>
           <w:sz w:val="18"/>
         </w:rPr>
-        <w:t xml:space="preserve">epoll </w:t>
+        <w:t>epoll</w:t>
+      </w:r>
+      <w:proofErr w:type="spellEnd"/>
+      <w:r>
+        <w:rPr>
+          <w:i/>
+          <w:color w:val="4B5563"/>
+          <w:sz w:val="18"/>
+        </w:rPr>
+        <w:t xml:space="preserve"> </w:t>
       </w:r>
       <w:r>
         <w:rPr>
@@ -18424,6 +19326,7 @@
         </w:rPr>
         <w:t xml:space="preserve">  ·  </w:t>
       </w:r>
+      <w:proofErr w:type="gramStart"/>
       <w:r>
         <w:rPr>
           <w:color w:val="4B5563"/>
@@ -18436,7 +19339,23 @@
           <w:color w:val="4B5563"/>
           <w:sz w:val="18"/>
         </w:rPr>
-        <w:t xml:space="preserve">  |  28:02:56</w:t>
+        <w:t xml:space="preserve">  |</w:t>
+      </w:r>
+      <w:proofErr w:type="gramEnd"/>
+      <w:r>
+        <w:rPr>
+          <w:color w:val="4B5563"/>
+          <w:sz w:val="18"/>
+        </w:rPr>
+        <w:t xml:space="preserve">  </w:t>
+      </w:r>
+      <w:proofErr w:type="gramStart"/>
+      <w:r>
+        <w:rPr>
+          <w:color w:val="4B5563"/>
+          <w:sz w:val="18"/>
+        </w:rPr>
+        <w:t>28:02:56</w:t>
       </w:r>
       <w:r>
         <w:rPr>
@@ -18444,7 +19363,16 @@
           <w:color w:val="4B5563"/>
           <w:sz w:val="18"/>
         </w:rPr>
-        <w:t xml:space="preserve">  |  </w:t>
+        <w:t xml:space="preserve">  |</w:t>
+      </w:r>
+      <w:proofErr w:type="gramEnd"/>
+      <w:r>
+        <w:rPr>
+          <w:i/>
+          <w:color w:val="4B5563"/>
+          <w:sz w:val="18"/>
+        </w:rPr>
+        <w:t xml:space="preserve">  </w:t>
       </w:r>
       <w:r>
         <w:rPr>
@@ -18516,6 +19444,7 @@
         </w:rPr>
         <w:t xml:space="preserve">  ·  </w:t>
       </w:r>
+      <w:proofErr w:type="gramStart"/>
       <w:r>
         <w:rPr>
           <w:color w:val="4B5563"/>
@@ -18528,7 +19457,23 @@
           <w:color w:val="4B5563"/>
           <w:sz w:val="18"/>
         </w:rPr>
-        <w:t xml:space="preserve">  |  12:28:24</w:t>
+        <w:t xml:space="preserve">  |</w:t>
+      </w:r>
+      <w:proofErr w:type="gramEnd"/>
+      <w:r>
+        <w:rPr>
+          <w:color w:val="4B5563"/>
+          <w:sz w:val="18"/>
+        </w:rPr>
+        <w:t xml:space="preserve">  </w:t>
+      </w:r>
+      <w:proofErr w:type="gramStart"/>
+      <w:r>
+        <w:rPr>
+          <w:color w:val="4B5563"/>
+          <w:sz w:val="18"/>
+        </w:rPr>
+        <w:t>12:28:24</w:t>
       </w:r>
       <w:r>
         <w:rPr>
@@ -18536,7 +19481,16 @@
           <w:color w:val="4B5563"/>
           <w:sz w:val="18"/>
         </w:rPr>
-        <w:t xml:space="preserve">  |  </w:t>
+        <w:t xml:space="preserve">  |</w:t>
+      </w:r>
+      <w:proofErr w:type="gramEnd"/>
+      <w:r>
+        <w:rPr>
+          <w:i/>
+          <w:color w:val="4B5563"/>
+          <w:sz w:val="18"/>
+        </w:rPr>
+        <w:t xml:space="preserve">  </w:t>
       </w:r>
       <w:r>
         <w:rPr>
@@ -18596,7 +19550,23 @@
           <w:color w:val="000000"/>
           <w:sz w:val="21"/>
         </w:rPr>
-        <w:t xml:space="preserve"> Vivado/Verilog</w:t>
+        <w:t xml:space="preserve"> </w:t>
+      </w:r>
+      <w:proofErr w:type="spellStart"/>
+      <w:r>
+        <w:rPr>
+          <w:color w:val="000000"/>
+          <w:sz w:val="21"/>
+        </w:rPr>
+        <w:t>Vivado</w:t>
+      </w:r>
+      <w:proofErr w:type="spellEnd"/>
+      <w:r>
+        <w:rPr>
+          <w:color w:val="000000"/>
+          <w:sz w:val="21"/>
+        </w:rPr>
+        <w:t>/Verilog</w:t>
       </w:r>
       <w:r>
         <w:rPr>
@@ -18678,7 +19648,40 @@
           <w:color w:val="4B5563"/>
           <w:sz w:val="18"/>
         </w:rPr>
-        <w:t xml:space="preserve">  ·  ICShen  |  11:56:12</w:t>
+        <w:t xml:space="preserve">  ·  </w:t>
+      </w:r>
+      <w:proofErr w:type="spellStart"/>
+      <w:proofErr w:type="gramStart"/>
+      <w:r>
+        <w:rPr>
+          <w:color w:val="4B5563"/>
+          <w:sz w:val="18"/>
+        </w:rPr>
+        <w:t>ICShen</w:t>
+      </w:r>
+      <w:proofErr w:type="spellEnd"/>
+      <w:r>
+        <w:rPr>
+          <w:color w:val="4B5563"/>
+          <w:sz w:val="18"/>
+        </w:rPr>
+        <w:t xml:space="preserve">  |</w:t>
+      </w:r>
+      <w:proofErr w:type="gramEnd"/>
+      <w:r>
+        <w:rPr>
+          <w:color w:val="4B5563"/>
+          <w:sz w:val="18"/>
+        </w:rPr>
+        <w:t xml:space="preserve">  </w:t>
+      </w:r>
+      <w:proofErr w:type="gramStart"/>
+      <w:r>
+        <w:rPr>
+          <w:color w:val="4B5563"/>
+          <w:sz w:val="18"/>
+        </w:rPr>
+        <w:t>11:56:12</w:t>
       </w:r>
       <w:r>
         <w:rPr>
@@ -18686,7 +19689,34 @@
           <w:color w:val="4B5563"/>
           <w:sz w:val="18"/>
         </w:rPr>
-        <w:t xml:space="preserve">  |  Vivado </w:t>
+        <w:t xml:space="preserve">  |</w:t>
+      </w:r>
+      <w:proofErr w:type="gramEnd"/>
+      <w:r>
+        <w:rPr>
+          <w:i/>
+          <w:color w:val="4B5563"/>
+          <w:sz w:val="18"/>
+        </w:rPr>
+        <w:t xml:space="preserve">  </w:t>
+      </w:r>
+      <w:proofErr w:type="spellStart"/>
+      <w:r>
+        <w:rPr>
+          <w:i/>
+          <w:color w:val="4B5563"/>
+          <w:sz w:val="18"/>
+        </w:rPr>
+        <w:t>Vivado</w:t>
+      </w:r>
+      <w:proofErr w:type="spellEnd"/>
+      <w:r>
+        <w:rPr>
+          <w:i/>
+          <w:color w:val="4B5563"/>
+          <w:sz w:val="18"/>
+        </w:rPr>
+        <w:t xml:space="preserve"> </w:t>
       </w:r>
       <w:r>
         <w:rPr>
@@ -18749,6 +19779,7 @@
         </w:rPr>
         <w:t xml:space="preserve">  ·  </w:t>
       </w:r>
+      <w:proofErr w:type="gramStart"/>
       <w:r>
         <w:rPr>
           <w:color w:val="4B5563"/>
@@ -18761,7 +19792,23 @@
           <w:color w:val="4B5563"/>
           <w:sz w:val="18"/>
         </w:rPr>
-        <w:t xml:space="preserve">  |  46:59:35</w:t>
+        <w:t xml:space="preserve">  |</w:t>
+      </w:r>
+      <w:proofErr w:type="gramEnd"/>
+      <w:r>
+        <w:rPr>
+          <w:color w:val="4B5563"/>
+          <w:sz w:val="18"/>
+        </w:rPr>
+        <w:t xml:space="preserve">  </w:t>
+      </w:r>
+      <w:proofErr w:type="gramStart"/>
+      <w:r>
+        <w:rPr>
+          <w:color w:val="4B5563"/>
+          <w:sz w:val="18"/>
+        </w:rPr>
+        <w:t>46:59:35</w:t>
       </w:r>
       <w:r>
         <w:rPr>
@@ -18769,7 +19816,16 @@
           <w:color w:val="4B5563"/>
           <w:sz w:val="18"/>
         </w:rPr>
-        <w:t xml:space="preserve">  |  PL </w:t>
+        <w:t xml:space="preserve">  |</w:t>
+      </w:r>
+      <w:proofErr w:type="gramEnd"/>
+      <w:r>
+        <w:rPr>
+          <w:i/>
+          <w:color w:val="4B5563"/>
+          <w:sz w:val="18"/>
+        </w:rPr>
+        <w:t xml:space="preserve">  PL </w:t>
       </w:r>
       <w:r>
         <w:rPr>
@@ -18832,6 +19888,7 @@
         </w:rPr>
         <w:t xml:space="preserve">  ·  </w:t>
       </w:r>
+      <w:proofErr w:type="gramStart"/>
       <w:r>
         <w:rPr>
           <w:color w:val="4B5563"/>
@@ -18844,7 +19901,23 @@
           <w:color w:val="4B5563"/>
           <w:sz w:val="18"/>
         </w:rPr>
-        <w:t xml:space="preserve">  |  41:14:02</w:t>
+        <w:t xml:space="preserve">  |</w:t>
+      </w:r>
+      <w:proofErr w:type="gramEnd"/>
+      <w:r>
+        <w:rPr>
+          <w:color w:val="4B5563"/>
+          <w:sz w:val="18"/>
+        </w:rPr>
+        <w:t xml:space="preserve">  </w:t>
+      </w:r>
+      <w:proofErr w:type="gramStart"/>
+      <w:r>
+        <w:rPr>
+          <w:color w:val="4B5563"/>
+          <w:sz w:val="18"/>
+        </w:rPr>
+        <w:t>41:14:02</w:t>
       </w:r>
       <w:r>
         <w:rPr>
@@ -18852,7 +19925,16 @@
           <w:color w:val="4B5563"/>
           <w:sz w:val="18"/>
         </w:rPr>
-        <w:t xml:space="preserve">  |  PS</w:t>
+        <w:t xml:space="preserve">  |</w:t>
+      </w:r>
+      <w:proofErr w:type="gramEnd"/>
+      <w:r>
+        <w:rPr>
+          <w:i/>
+          <w:color w:val="4B5563"/>
+          <w:sz w:val="18"/>
+        </w:rPr>
+        <w:t xml:space="preserve">  PS</w:t>
       </w:r>
       <w:r>
         <w:rPr>
@@ -18938,12 +20020,29 @@
         </w:rPr>
         <w:t>小梅哥</w:t>
       </w:r>
-      <w:r>
-        <w:rPr>
-          <w:color w:val="4B5563"/>
-          <w:sz w:val="18"/>
-        </w:rPr>
-        <w:t>FPGA  |  48:37:01</w:t>
+      <w:proofErr w:type="gramStart"/>
+      <w:r>
+        <w:rPr>
+          <w:color w:val="4B5563"/>
+          <w:sz w:val="18"/>
+        </w:rPr>
+        <w:t>FPGA  |</w:t>
+      </w:r>
+      <w:proofErr w:type="gramEnd"/>
+      <w:r>
+        <w:rPr>
+          <w:color w:val="4B5563"/>
+          <w:sz w:val="18"/>
+        </w:rPr>
+        <w:t xml:space="preserve">  </w:t>
+      </w:r>
+      <w:proofErr w:type="gramStart"/>
+      <w:r>
+        <w:rPr>
+          <w:color w:val="4B5563"/>
+          <w:sz w:val="18"/>
+        </w:rPr>
+        <w:t>48:37:01</w:t>
       </w:r>
       <w:r>
         <w:rPr>
@@ -18951,7 +20050,16 @@
           <w:color w:val="4B5563"/>
           <w:sz w:val="18"/>
         </w:rPr>
-        <w:t xml:space="preserve">  |  Verilog </w:t>
+        <w:t xml:space="preserve">  |</w:t>
+      </w:r>
+      <w:proofErr w:type="gramEnd"/>
+      <w:r>
+        <w:rPr>
+          <w:i/>
+          <w:color w:val="4B5563"/>
+          <w:sz w:val="18"/>
+        </w:rPr>
+        <w:t xml:space="preserve">  Verilog </w:t>
       </w:r>
       <w:r>
         <w:rPr>
@@ -19021,12 +20129,29 @@
         </w:rPr>
         <w:t>学习使我快乐</w:t>
       </w:r>
-      <w:r>
-        <w:rPr>
-          <w:color w:val="4B5563"/>
-          <w:sz w:val="18"/>
-        </w:rPr>
-        <w:t>100  |  1:35:02</w:t>
+      <w:proofErr w:type="gramStart"/>
+      <w:r>
+        <w:rPr>
+          <w:color w:val="4B5563"/>
+          <w:sz w:val="18"/>
+        </w:rPr>
+        <w:t>100  |</w:t>
+      </w:r>
+      <w:proofErr w:type="gramEnd"/>
+      <w:r>
+        <w:rPr>
+          <w:color w:val="4B5563"/>
+          <w:sz w:val="18"/>
+        </w:rPr>
+        <w:t xml:space="preserve">  </w:t>
+      </w:r>
+      <w:proofErr w:type="gramStart"/>
+      <w:r>
+        <w:rPr>
+          <w:color w:val="4B5563"/>
+          <w:sz w:val="18"/>
+        </w:rPr>
+        <w:t>1:35:02</w:t>
       </w:r>
       <w:r>
         <w:rPr>
@@ -19034,7 +20159,16 @@
           <w:color w:val="4B5563"/>
           <w:sz w:val="18"/>
         </w:rPr>
-        <w:t xml:space="preserve">  |  </w:t>
+        <w:t xml:space="preserve">  |</w:t>
+      </w:r>
+      <w:proofErr w:type="gramEnd"/>
+      <w:r>
+        <w:rPr>
+          <w:i/>
+          <w:color w:val="4B5563"/>
+          <w:sz w:val="18"/>
+        </w:rPr>
+        <w:t xml:space="preserve">  </w:t>
       </w:r>
       <w:r>
         <w:rPr>
@@ -19113,6 +20247,7 @@
         </w:rPr>
         <w:t xml:space="preserve">  ·  </w:t>
       </w:r>
+      <w:proofErr w:type="gramStart"/>
       <w:r>
         <w:rPr>
           <w:color w:val="4B5563"/>
@@ -19125,7 +20260,23 @@
           <w:color w:val="4B5563"/>
           <w:sz w:val="18"/>
         </w:rPr>
-        <w:t xml:space="preserve">  |  4:52:07</w:t>
+        <w:t xml:space="preserve">  |</w:t>
+      </w:r>
+      <w:proofErr w:type="gramEnd"/>
+      <w:r>
+        <w:rPr>
+          <w:color w:val="4B5563"/>
+          <w:sz w:val="18"/>
+        </w:rPr>
+        <w:t xml:space="preserve">  </w:t>
+      </w:r>
+      <w:proofErr w:type="gramStart"/>
+      <w:r>
+        <w:rPr>
+          <w:color w:val="4B5563"/>
+          <w:sz w:val="18"/>
+        </w:rPr>
+        <w:t>4:52:07</w:t>
       </w:r>
       <w:r>
         <w:rPr>
@@ -19133,7 +20284,16 @@
           <w:color w:val="4B5563"/>
           <w:sz w:val="18"/>
         </w:rPr>
-        <w:t xml:space="preserve">  |  C/C++ </w:t>
+        <w:t xml:space="preserve">  |</w:t>
+      </w:r>
+      <w:proofErr w:type="gramEnd"/>
+      <w:r>
+        <w:rPr>
+          <w:i/>
+          <w:color w:val="4B5563"/>
+          <w:sz w:val="18"/>
+        </w:rPr>
+        <w:t xml:space="preserve">  C/C++ </w:t>
       </w:r>
       <w:r>
         <w:rPr>
@@ -19195,12 +20355,29 @@
         </w:rPr>
         <w:t>开源骚客</w:t>
       </w:r>
-      <w:r>
-        <w:rPr>
-          <w:color w:val="4B5563"/>
-          <w:sz w:val="18"/>
-        </w:rPr>
-        <w:t>FPGA  |  11:40:39</w:t>
+      <w:proofErr w:type="gramStart"/>
+      <w:r>
+        <w:rPr>
+          <w:color w:val="4B5563"/>
+          <w:sz w:val="18"/>
+        </w:rPr>
+        <w:t>FPGA  |</w:t>
+      </w:r>
+      <w:proofErr w:type="gramEnd"/>
+      <w:r>
+        <w:rPr>
+          <w:color w:val="4B5563"/>
+          <w:sz w:val="18"/>
+        </w:rPr>
+        <w:t xml:space="preserve">  </w:t>
+      </w:r>
+      <w:proofErr w:type="gramStart"/>
+      <w:r>
+        <w:rPr>
+          <w:color w:val="4B5563"/>
+          <w:sz w:val="18"/>
+        </w:rPr>
+        <w:t>11:40:39</w:t>
       </w:r>
       <w:r>
         <w:rPr>
@@ -19208,7 +20385,16 @@
           <w:color w:val="4B5563"/>
           <w:sz w:val="18"/>
         </w:rPr>
-        <w:t xml:space="preserve">  |  </w:t>
+        <w:t xml:space="preserve">  |</w:t>
+      </w:r>
+      <w:proofErr w:type="gramEnd"/>
+      <w:r>
+        <w:rPr>
+          <w:i/>
+          <w:color w:val="4B5563"/>
+          <w:sz w:val="18"/>
+        </w:rPr>
+        <w:t xml:space="preserve">  </w:t>
       </w:r>
       <w:r>
         <w:rPr>
@@ -19295,6 +20481,7 @@
         </w:rPr>
         <w:t xml:space="preserve">  ·  FPGA</w:t>
       </w:r>
+      <w:proofErr w:type="gramStart"/>
       <w:r>
         <w:rPr>
           <w:color w:val="4B5563"/>
@@ -19307,7 +20494,23 @@
           <w:color w:val="4B5563"/>
           <w:sz w:val="18"/>
         </w:rPr>
-        <w:t xml:space="preserve">  |  2:17:22</w:t>
+        <w:t xml:space="preserve">  |</w:t>
+      </w:r>
+      <w:proofErr w:type="gramEnd"/>
+      <w:r>
+        <w:rPr>
+          <w:color w:val="4B5563"/>
+          <w:sz w:val="18"/>
+        </w:rPr>
+        <w:t xml:space="preserve">  </w:t>
+      </w:r>
+      <w:proofErr w:type="gramStart"/>
+      <w:r>
+        <w:rPr>
+          <w:color w:val="4B5563"/>
+          <w:sz w:val="18"/>
+        </w:rPr>
+        <w:t>2:17:22</w:t>
       </w:r>
       <w:r>
         <w:rPr>
@@ -19315,7 +20518,16 @@
           <w:color w:val="4B5563"/>
           <w:sz w:val="18"/>
         </w:rPr>
-        <w:t xml:space="preserve">  |  PS-PL </w:t>
+        <w:t xml:space="preserve">  |</w:t>
+      </w:r>
+      <w:proofErr w:type="gramEnd"/>
+      <w:r>
+        <w:rPr>
+          <w:i/>
+          <w:color w:val="4B5563"/>
+          <w:sz w:val="18"/>
+        </w:rPr>
+        <w:t xml:space="preserve">  PS-PL </w:t>
       </w:r>
       <w:r>
         <w:rPr>
@@ -19383,8 +20595,17 @@
           <w:color w:val="000000"/>
           <w:sz w:val="21"/>
         </w:rPr>
-        <w:t xml:space="preserve"> PyTorch</w:t>
-      </w:r>
+        <w:t xml:space="preserve"> </w:t>
+      </w:r>
+      <w:proofErr w:type="spellStart"/>
+      <w:r>
+        <w:rPr>
+          <w:color w:val="000000"/>
+          <w:sz w:val="21"/>
+        </w:rPr>
+        <w:t>PyTorch</w:t>
+      </w:r>
+      <w:proofErr w:type="spellEnd"/>
       <w:r>
         <w:rPr>
           <w:color w:val="000000"/>
@@ -19539,6 +20760,7 @@
         </w:rPr>
         <w:t>C-</w:t>
       </w:r>
+      <w:proofErr w:type="gramStart"/>
       <w:r>
         <w:rPr>
           <w:color w:val="4B5563"/>
@@ -19551,7 +20773,23 @@
           <w:color w:val="4B5563"/>
           <w:sz w:val="18"/>
         </w:rPr>
-        <w:t xml:space="preserve">  |  17:35:28</w:t>
+        <w:t xml:space="preserve">  |</w:t>
+      </w:r>
+      <w:proofErr w:type="gramEnd"/>
+      <w:r>
+        <w:rPr>
+          <w:color w:val="4B5563"/>
+          <w:sz w:val="18"/>
+        </w:rPr>
+        <w:t xml:space="preserve">  </w:t>
+      </w:r>
+      <w:proofErr w:type="gramStart"/>
+      <w:r>
+        <w:rPr>
+          <w:color w:val="4B5563"/>
+          <w:sz w:val="18"/>
+        </w:rPr>
+        <w:t>17:35:28</w:t>
       </w:r>
       <w:r>
         <w:rPr>
@@ -19559,7 +20797,16 @@
           <w:color w:val="4B5563"/>
           <w:sz w:val="18"/>
         </w:rPr>
-        <w:t xml:space="preserve">  |  Python </w:t>
+        <w:t xml:space="preserve">  |</w:t>
+      </w:r>
+      <w:proofErr w:type="gramEnd"/>
+      <w:r>
+        <w:rPr>
+          <w:i/>
+          <w:color w:val="4B5563"/>
+          <w:sz w:val="18"/>
+        </w:rPr>
+        <w:t xml:space="preserve">  Python </w:t>
       </w:r>
       <w:r>
         <w:rPr>
@@ -19614,6 +20861,7 @@
         </w:rPr>
         <w:t xml:space="preserve">  ·  </w:t>
       </w:r>
+      <w:proofErr w:type="gramStart"/>
       <w:r>
         <w:rPr>
           <w:color w:val="4B5563"/>
@@ -19626,7 +20874,23 @@
           <w:color w:val="4B5563"/>
           <w:sz w:val="18"/>
         </w:rPr>
-        <w:t xml:space="preserve">  |  9:50:38</w:t>
+        <w:t xml:space="preserve">  |</w:t>
+      </w:r>
+      <w:proofErr w:type="gramEnd"/>
+      <w:r>
+        <w:rPr>
+          <w:color w:val="4B5563"/>
+          <w:sz w:val="18"/>
+        </w:rPr>
+        <w:t xml:space="preserve">  </w:t>
+      </w:r>
+      <w:proofErr w:type="gramStart"/>
+      <w:r>
+        <w:rPr>
+          <w:color w:val="4B5563"/>
+          <w:sz w:val="18"/>
+        </w:rPr>
+        <w:t>9:50:38</w:t>
       </w:r>
       <w:r>
         <w:rPr>
@@ -19634,7 +20898,16 @@
           <w:color w:val="4B5563"/>
           <w:sz w:val="18"/>
         </w:rPr>
-        <w:t xml:space="preserve">  |  </w:t>
+        <w:t xml:space="preserve">  |</w:t>
+      </w:r>
+      <w:proofErr w:type="gramEnd"/>
+      <w:r>
+        <w:rPr>
+          <w:i/>
+          <w:color w:val="4B5563"/>
+          <w:sz w:val="18"/>
+        </w:rPr>
+        <w:t xml:space="preserve">  </w:t>
       </w:r>
       <w:r>
         <w:rPr>
@@ -19689,6 +20962,7 @@
         </w:rPr>
         <w:t xml:space="preserve">  ·  </w:t>
       </w:r>
+      <w:proofErr w:type="gramStart"/>
       <w:r>
         <w:rPr>
           <w:color w:val="4B5563"/>
@@ -19701,7 +20975,23 @@
           <w:color w:val="4B5563"/>
           <w:sz w:val="18"/>
         </w:rPr>
-        <w:t xml:space="preserve">  |  4:47:31</w:t>
+        <w:t xml:space="preserve">  |</w:t>
+      </w:r>
+      <w:proofErr w:type="gramEnd"/>
+      <w:r>
+        <w:rPr>
+          <w:color w:val="4B5563"/>
+          <w:sz w:val="18"/>
+        </w:rPr>
+        <w:t xml:space="preserve">  </w:t>
+      </w:r>
+      <w:proofErr w:type="gramStart"/>
+      <w:r>
+        <w:rPr>
+          <w:color w:val="4B5563"/>
+          <w:sz w:val="18"/>
+        </w:rPr>
+        <w:t>4:47:31</w:t>
       </w:r>
       <w:r>
         <w:rPr>
@@ -19709,7 +20999,16 @@
           <w:color w:val="4B5563"/>
           <w:sz w:val="18"/>
         </w:rPr>
-        <w:t xml:space="preserve">  |  GPU </w:t>
+        <w:t xml:space="preserve">  |</w:t>
+      </w:r>
+      <w:proofErr w:type="gramEnd"/>
+      <w:r>
+        <w:rPr>
+          <w:i/>
+          <w:color w:val="4B5563"/>
+          <w:sz w:val="18"/>
+        </w:rPr>
+        <w:t xml:space="preserve">  GPU </w:t>
       </w:r>
       <w:r>
         <w:rPr>
@@ -19788,6 +21087,7 @@
         </w:rPr>
         <w:t xml:space="preserve">  ·  </w:t>
       </w:r>
+      <w:proofErr w:type="gramStart"/>
       <w:r>
         <w:rPr>
           <w:color w:val="4B5563"/>
@@ -19800,7 +21100,23 @@
           <w:color w:val="4B5563"/>
           <w:sz w:val="18"/>
         </w:rPr>
-        <w:t xml:space="preserve">  |  10:01:22</w:t>
+        <w:t xml:space="preserve">  |</w:t>
+      </w:r>
+      <w:proofErr w:type="gramEnd"/>
+      <w:r>
+        <w:rPr>
+          <w:color w:val="4B5563"/>
+          <w:sz w:val="18"/>
+        </w:rPr>
+        <w:t xml:space="preserve">  </w:t>
+      </w:r>
+      <w:proofErr w:type="gramStart"/>
+      <w:r>
+        <w:rPr>
+          <w:color w:val="4B5563"/>
+          <w:sz w:val="18"/>
+        </w:rPr>
+        <w:t>10:01:22</w:t>
       </w:r>
       <w:r>
         <w:rPr>
@@ -19808,7 +21124,16 @@
           <w:color w:val="4B5563"/>
           <w:sz w:val="18"/>
         </w:rPr>
-        <w:t xml:space="preserve">  |  AI </w:t>
+        <w:t xml:space="preserve">  |</w:t>
+      </w:r>
+      <w:proofErr w:type="gramEnd"/>
+      <w:r>
+        <w:rPr>
+          <w:i/>
+          <w:color w:val="4B5563"/>
+          <w:sz w:val="18"/>
+        </w:rPr>
+        <w:t xml:space="preserve">  AI </w:t>
       </w:r>
       <w:r>
         <w:rPr>
@@ -19903,6 +21228,7 @@
         </w:rPr>
         <w:t xml:space="preserve">  ·  </w:t>
       </w:r>
+      <w:proofErr w:type="gramStart"/>
       <w:r>
         <w:rPr>
           <w:color w:val="4B5563"/>
@@ -19915,7 +21241,23 @@
           <w:color w:val="4B5563"/>
           <w:sz w:val="18"/>
         </w:rPr>
-        <w:t xml:space="preserve">  |  15:31:31</w:t>
+        <w:t xml:space="preserve">  |</w:t>
+      </w:r>
+      <w:proofErr w:type="gramEnd"/>
+      <w:r>
+        <w:rPr>
+          <w:color w:val="4B5563"/>
+          <w:sz w:val="18"/>
+        </w:rPr>
+        <w:t xml:space="preserve">  </w:t>
+      </w:r>
+      <w:proofErr w:type="gramStart"/>
+      <w:r>
+        <w:rPr>
+          <w:color w:val="4B5563"/>
+          <w:sz w:val="18"/>
+        </w:rPr>
+        <w:t>15:31:31</w:t>
       </w:r>
       <w:r>
         <w:rPr>
@@ -19923,7 +21265,16 @@
           <w:color w:val="4B5563"/>
           <w:sz w:val="18"/>
         </w:rPr>
-        <w:t xml:space="preserve">  |  RAG </w:t>
+        <w:t xml:space="preserve">  |</w:t>
+      </w:r>
+      <w:proofErr w:type="gramEnd"/>
+      <w:r>
+        <w:rPr>
+          <w:i/>
+          <w:color w:val="4B5563"/>
+          <w:sz w:val="18"/>
+        </w:rPr>
+        <w:t xml:space="preserve">  RAG </w:t>
       </w:r>
       <w:r>
         <w:rPr>
@@ -19994,6 +21345,7 @@
         </w:rPr>
         <w:t xml:space="preserve">  ·  </w:t>
       </w:r>
+      <w:proofErr w:type="gramStart"/>
       <w:r>
         <w:rPr>
           <w:color w:val="4B5563"/>
@@ -20006,7 +21358,23 @@
           <w:color w:val="4B5563"/>
           <w:sz w:val="18"/>
         </w:rPr>
-        <w:t xml:space="preserve">  |  27:06</w:t>
+        <w:t xml:space="preserve">  |</w:t>
+      </w:r>
+      <w:proofErr w:type="gramEnd"/>
+      <w:r>
+        <w:rPr>
+          <w:color w:val="4B5563"/>
+          <w:sz w:val="18"/>
+        </w:rPr>
+        <w:t xml:space="preserve">  </w:t>
+      </w:r>
+      <w:proofErr w:type="gramStart"/>
+      <w:r>
+        <w:rPr>
+          <w:color w:val="4B5563"/>
+          <w:sz w:val="18"/>
+        </w:rPr>
+        <w:t>27:06</w:t>
       </w:r>
       <w:r>
         <w:rPr>
@@ -20014,7 +21382,16 @@
           <w:color w:val="4B5563"/>
           <w:sz w:val="18"/>
         </w:rPr>
-        <w:t xml:space="preserve">  |  MCP </w:t>
+        <w:t xml:space="preserve">  |</w:t>
+      </w:r>
+      <w:proofErr w:type="gramEnd"/>
+      <w:r>
+        <w:rPr>
+          <w:i/>
+          <w:color w:val="4B5563"/>
+          <w:sz w:val="18"/>
+        </w:rPr>
+        <w:t xml:space="preserve">  MCP </w:t>
       </w:r>
       <w:r>
         <w:rPr>
@@ -20093,6 +21470,7 @@
         </w:rPr>
         <w:t xml:space="preserve">  ·  </w:t>
       </w:r>
+      <w:proofErr w:type="gramStart"/>
       <w:r>
         <w:rPr>
           <w:color w:val="4B5563"/>
@@ -20105,7 +21483,23 @@
           <w:color w:val="4B5563"/>
           <w:sz w:val="18"/>
         </w:rPr>
-        <w:t xml:space="preserve">  |  32:31</w:t>
+        <w:t xml:space="preserve">  |</w:t>
+      </w:r>
+      <w:proofErr w:type="gramEnd"/>
+      <w:r>
+        <w:rPr>
+          <w:color w:val="4B5563"/>
+          <w:sz w:val="18"/>
+        </w:rPr>
+        <w:t xml:space="preserve">  32:</w:t>
+      </w:r>
+      <w:proofErr w:type="gramStart"/>
+      <w:r>
+        <w:rPr>
+          <w:color w:val="4B5563"/>
+          <w:sz w:val="18"/>
+        </w:rPr>
+        <w:t>31</w:t>
       </w:r>
       <w:r>
         <w:rPr>
@@ -20113,7 +21507,16 @@
           <w:color w:val="4B5563"/>
           <w:sz w:val="18"/>
         </w:rPr>
-        <w:t xml:space="preserve">  |  Agent </w:t>
+        <w:t xml:space="preserve">  |</w:t>
+      </w:r>
+      <w:proofErr w:type="gramEnd"/>
+      <w:r>
+        <w:rPr>
+          <w:i/>
+          <w:color w:val="4B5563"/>
+          <w:sz w:val="18"/>
+        </w:rPr>
+        <w:t xml:space="preserve">  Agent </w:t>
       </w:r>
       <w:r>
         <w:rPr>
@@ -20174,12 +21577,37 @@
       </w:tabs>
       <w:spacing w:before="80" w:after="0"/>
     </w:pPr>
+    <w:proofErr w:type="gramStart"/>
     <w:r>
       <w:rPr>
         <w:color w:val="4B5563"/>
         <w:sz w:val="16"/>
       </w:rPr>
-      <w:t>OPENCOLINKLAB  |  BETA  |  2026</w:t>
+      <w:t>OPENCOLINKLAB  |</w:t>
+    </w:r>
+    <w:proofErr w:type="gramEnd"/>
+    <w:r>
+      <w:rPr>
+        <w:color w:val="4B5563"/>
+        <w:sz w:val="16"/>
+      </w:rPr>
+      <w:t xml:space="preserve">  </w:t>
+    </w:r>
+    <w:proofErr w:type="gramStart"/>
+    <w:r>
+      <w:rPr>
+        <w:color w:val="4B5563"/>
+        <w:sz w:val="16"/>
+      </w:rPr>
+      <w:t>BETA  |</w:t>
+    </w:r>
+    <w:proofErr w:type="gramEnd"/>
+    <w:r>
+      <w:rPr>
+        <w:color w:val="4B5563"/>
+        <w:sz w:val="16"/>
+      </w:rPr>
+      <w:t xml:space="preserve">  2026</w:t>
     </w:r>
     <w:r>
       <w:rPr>
@@ -20290,8 +21718,24 @@
         <w:sz w:val="17"/>
       </w:rPr>
       <w:tab/>
-      <w:t xml:space="preserve">OpenColink </w:t>
     </w:r>
+    <w:proofErr w:type="spellStart"/>
+    <w:r>
+      <w:rPr>
+        <w:color w:val="4B5563"/>
+        <w:sz w:val="17"/>
+      </w:rPr>
+      <w:t>OpenColink</w:t>
+    </w:r>
+    <w:proofErr w:type="spellEnd"/>
+    <w:r>
+      <w:rPr>
+        <w:color w:val="4B5563"/>
+        <w:sz w:val="17"/>
+      </w:rPr>
+      <w:t xml:space="preserve"> </w:t>
+    </w:r>
+    <w:proofErr w:type="gramStart"/>
     <w:r>
       <w:rPr>
         <w:color w:val="4B5563"/>
@@ -20304,7 +21748,15 @@
         <w:color w:val="4B5563"/>
         <w:sz w:val="17"/>
       </w:rPr>
-      <w:t xml:space="preserve">  |  Zynq </w:t>
+      <w:t xml:space="preserve">  |</w:t>
+    </w:r>
+    <w:proofErr w:type="gramEnd"/>
+    <w:r>
+      <w:rPr>
+        <w:color w:val="4B5563"/>
+        <w:sz w:val="17"/>
+      </w:rPr>
+      <w:t xml:space="preserve">  Zynq </w:t>
     </w:r>
     <w:r>
       <w:rPr>

</xml_diff>